<commit_message>
ComputeExtrap: 1) modified code so velocity data type is not discharge weighted; 2) modified code to support passing of use_weighted NormData: 1) updated documentation, 2) modified where discharge is computed, 3) discharge used for weighting but not for unit values, 4) discharge used for extents, 5) only discharge data type can be weighted ExtraPlot: 1) minor adjustment to location of text on figure QRev 1) fixed bug in rating if measurement not rated Updated documentation
</commit_message>
<xml_diff>
--- a/UI/Help/QRev_About.docx
+++ b/UI/Help/QRev_About.docx
@@ -113,7 +113,7 @@
           <w:b/>
           <w:bCs/>
         </w:rPr>
-        <w:t>3</w:t>
+        <w:t>4</w:t>
       </w:r>
       <w:r>
         <w:rPr>
@@ -134,21 +134,7 @@
           <w:b/>
           <w:bCs/>
         </w:rPr>
-        <w:t>10</w:t>
-      </w:r>
-      <w:r>
-        <w:rPr>
-          <w:b/>
-          <w:bCs/>
-        </w:rPr>
-        <w:t>/</w:t>
-      </w:r>
-      <w:r>
-        <w:rPr>
-          <w:b/>
-          <w:bCs/>
-        </w:rPr>
-        <w:t>23</w:t>
+        <w:t>12/21</w:t>
       </w:r>
       <w:r>
         <w:rPr>

</xml_diff>

<commit_message>
Added QRevInt.ico Edited LICENSE.md robust_loess.py: 1) modified to trap error and then ignore mask Updated About and Change log to reflect QRevInt and changes Finalized as QRevInt 4.26 Beta
</commit_message>
<xml_diff>
--- a/UI/Help/QRev_About.docx
+++ b/UI/Help/QRev_About.docx
@@ -1,6 +1,6 @@
 
 <file path=word/document.xml><?xml version="1.0" encoding="utf-8"?>
-<w:document xmlns:wpc="http://schemas.microsoft.com/office/word/2010/wordprocessingCanvas" xmlns:cx="http://schemas.microsoft.com/office/drawing/2014/chartex" xmlns:cx1="http://schemas.microsoft.com/office/drawing/2015/9/8/chartex" xmlns:cx2="http://schemas.microsoft.com/office/drawing/2015/10/21/chartex" xmlns:cx3="http://schemas.microsoft.com/office/drawing/2016/5/9/chartex" xmlns:cx4="http://schemas.microsoft.com/office/drawing/2016/5/10/chartex" xmlns:cx5="http://schemas.microsoft.com/office/drawing/2016/5/11/chartex" xmlns:cx6="http://schemas.microsoft.com/office/drawing/2016/5/12/chartex" xmlns:cx7="http://schemas.microsoft.com/office/drawing/2016/5/13/chartex" xmlns:cx8="http://schemas.microsoft.com/office/drawing/2016/5/14/chartex" xmlns:mc="http://schemas.openxmlformats.org/markup-compatibility/2006" xmlns:aink="http://schemas.microsoft.com/office/drawing/2016/ink" xmlns:am3d="http://schemas.microsoft.com/office/drawing/2017/model3d" xmlns:o="urn:schemas-microsoft-com:office:office" xmlns:r="http://schemas.openxmlformats.org/officeDocument/2006/relationships" xmlns:m="http://schemas.openxmlformats.org/officeDocument/2006/math" xmlns:v="urn:schemas-microsoft-com:vml" xmlns:wp14="http://schemas.microsoft.com/office/word/2010/wordprocessingDrawing" xmlns:wp="http://schemas.openxmlformats.org/drawingml/2006/wordprocessingDrawing" xmlns:w10="urn:schemas-microsoft-com:office:word" xmlns:w="http://schemas.openxmlformats.org/wordprocessingml/2006/main" xmlns:w14="http://schemas.microsoft.com/office/word/2010/wordml" xmlns:w15="http://schemas.microsoft.com/office/word/2012/wordml" xmlns:w16cid="http://schemas.microsoft.com/office/word/2016/wordml/cid" xmlns:w16se="http://schemas.microsoft.com/office/word/2015/wordml/symex" xmlns:wpg="http://schemas.microsoft.com/office/word/2010/wordprocessingGroup" xmlns:wpi="http://schemas.microsoft.com/office/word/2010/wordprocessingInk" xmlns:wne="http://schemas.microsoft.com/office/word/2006/wordml" xmlns:wps="http://schemas.microsoft.com/office/word/2010/wordprocessingShape" mc:Ignorable="w14 w15 w16se w16cid wp14">
+<w:document xmlns:wpc="http://schemas.microsoft.com/office/word/2010/wordprocessingCanvas" xmlns:cx="http://schemas.microsoft.com/office/drawing/2014/chartex" xmlns:cx1="http://schemas.microsoft.com/office/drawing/2015/9/8/chartex" xmlns:cx2="http://schemas.microsoft.com/office/drawing/2015/10/21/chartex" xmlns:cx3="http://schemas.microsoft.com/office/drawing/2016/5/9/chartex" xmlns:cx4="http://schemas.microsoft.com/office/drawing/2016/5/10/chartex" xmlns:cx5="http://schemas.microsoft.com/office/drawing/2016/5/11/chartex" xmlns:cx6="http://schemas.microsoft.com/office/drawing/2016/5/12/chartex" xmlns:cx7="http://schemas.microsoft.com/office/drawing/2016/5/13/chartex" xmlns:cx8="http://schemas.microsoft.com/office/drawing/2016/5/14/chartex" xmlns:mc="http://schemas.openxmlformats.org/markup-compatibility/2006" xmlns:aink="http://schemas.microsoft.com/office/drawing/2016/ink" xmlns:am3d="http://schemas.microsoft.com/office/drawing/2017/model3d" xmlns:o="urn:schemas-microsoft-com:office:office" xmlns:r="http://schemas.openxmlformats.org/officeDocument/2006/relationships" xmlns:m="http://schemas.openxmlformats.org/officeDocument/2006/math" xmlns:v="urn:schemas-microsoft-com:vml" xmlns:wp14="http://schemas.microsoft.com/office/word/2010/wordprocessingDrawing" xmlns:wp="http://schemas.openxmlformats.org/drawingml/2006/wordprocessingDrawing" xmlns:w10="urn:schemas-microsoft-com:office:word" xmlns:w="http://schemas.openxmlformats.org/wordprocessingml/2006/main" xmlns:w14="http://schemas.microsoft.com/office/word/2010/wordml" xmlns:w15="http://schemas.microsoft.com/office/word/2012/wordml" xmlns:w16cex="http://schemas.microsoft.com/office/word/2018/wordml/cex" xmlns:w16cid="http://schemas.microsoft.com/office/word/2016/wordml/cid" xmlns:w16="http://schemas.microsoft.com/office/word/2018/wordml" xmlns:w16se="http://schemas.microsoft.com/office/word/2015/wordml/symex" xmlns:wpg="http://schemas.microsoft.com/office/word/2010/wordprocessingGroup" xmlns:wpi="http://schemas.microsoft.com/office/word/2010/wordprocessingInk" xmlns:wne="http://schemas.microsoft.com/office/word/2006/wordml" xmlns:wps="http://schemas.microsoft.com/office/word/2010/wordprocessingShape" mc:Ignorable="w14 w15 w16se w16cid w16 w16cex wp14">
   <w:body>
     <w:p>
       <w:pPr>
@@ -16,14 +16,14 @@
           <w:b/>
           <w:bCs/>
           <w:noProof/>
-          <w:sz w:val="32"/>
-          <w:szCs w:val="32"/>
+          <w:sz w:val="96"/>
+          <w:szCs w:val="96"/>
         </w:rPr>
         <w:drawing>
-          <wp:inline distT="0" distB="0" distL="0" distR="0" wp14:anchorId="1908AF86" wp14:editId="4B2EA2A7">
-            <wp:extent cx="476250" cy="476250"/>
+          <wp:inline distT="0" distB="0" distL="0" distR="0" wp14:anchorId="4B577E6D" wp14:editId="47C42B4B">
+            <wp:extent cx="558800" cy="558800"/>
             <wp:effectExtent l="0" t="0" r="0" b="0"/>
-            <wp:docPr id="1" name="Picture 1" descr="A close up of a logo&#10;&#10;Description automatically generated"/>
+            <wp:docPr id="3" name="Picture 3" descr="Icon&#10;&#10;Description automatically generated"/>
             <wp:cNvGraphicFramePr>
               <a:graphicFrameLocks xmlns:a="http://schemas.openxmlformats.org/drawingml/2006/main" noChangeAspect="1"/>
             </wp:cNvGraphicFramePr>
@@ -31,7 +31,7 @@
               <a:graphicData uri="http://schemas.openxmlformats.org/drawingml/2006/picture">
                 <pic:pic xmlns:pic="http://schemas.openxmlformats.org/drawingml/2006/picture">
                   <pic:nvPicPr>
-                    <pic:cNvPr id="1" name="QRev.ico"/>
+                    <pic:cNvPr id="3" name="Picture 3" descr="Icon&#10;&#10;Description automatically generated"/>
                     <pic:cNvPicPr/>
                   </pic:nvPicPr>
                   <pic:blipFill>
@@ -49,7 +49,7 @@
                   <pic:spPr>
                     <a:xfrm>
                       <a:off x="0" y="0"/>
-                      <a:ext cx="476250" cy="476250"/>
+                      <a:ext cx="558800" cy="558800"/>
                     </a:xfrm>
                     <a:prstGeom prst="rect">
                       <a:avLst/>
@@ -70,6 +70,7 @@
         </w:rPr>
         <w:t xml:space="preserve"> </w:t>
       </w:r>
+      <w:proofErr w:type="spellStart"/>
       <w:r>
         <w:rPr>
           <w:b/>
@@ -79,6 +80,16 @@
         </w:rPr>
         <w:t>QRev</w:t>
       </w:r>
+      <w:r>
+        <w:rPr>
+          <w:b/>
+          <w:bCs/>
+          <w:sz w:val="96"/>
+          <w:szCs w:val="96"/>
+        </w:rPr>
+        <w:t>Int</w:t>
+      </w:r>
+      <w:proofErr w:type="spellEnd"/>
     </w:p>
     <w:p>
       <w:pPr>
@@ -113,7 +124,7 @@
           <w:b/>
           <w:bCs/>
         </w:rPr>
-        <w:t>4</w:t>
+        <w:t>6 Beta</w:t>
       </w:r>
       <w:r>
         <w:rPr>
@@ -134,17 +145,36 @@
           <w:b/>
           <w:bCs/>
         </w:rPr>
-        <w:t>12/21</w:t>
-      </w:r>
-      <w:r>
-        <w:rPr>
-          <w:b/>
-          <w:bCs/>
-        </w:rPr>
-        <w:t>/2020</w:t>
-      </w:r>
-      <w:bookmarkStart w:id="0" w:name="_GoBack"/>
-      <w:bookmarkEnd w:id="0"/>
+        <w:t>2/</w:t>
+      </w:r>
+      <w:r>
+        <w:rPr>
+          <w:b/>
+          <w:bCs/>
+        </w:rPr>
+        <w:t>1</w:t>
+      </w:r>
+      <w:r>
+        <w:rPr>
+          <w:b/>
+          <w:bCs/>
+        </w:rPr>
+        <w:t>1</w:t>
+      </w:r>
+      <w:r>
+        <w:rPr>
+          <w:b/>
+          <w:bCs/>
+        </w:rPr>
+        <w:t>/202</w:t>
+      </w:r>
+      <w:r>
+        <w:rPr>
+          <w:b/>
+          <w:bCs/>
+        </w:rPr>
+        <w:t>1</w:t>
+      </w:r>
     </w:p>
     <w:p>
       <w:pPr>
@@ -165,7 +195,7 @@
           <w:rPr>
             <w:rStyle w:val="Hyperlink"/>
           </w:rPr>
-          <w:t>https://simon.er.usgs.gov/smf/index.php?board=53.0</w:t>
+          <w:t>dave@genesishydrotech.com</w:t>
         </w:r>
       </w:hyperlink>
     </w:p>
@@ -182,7 +212,7 @@
           <w:rPr>
             <w:rStyle w:val="Hyperlink"/>
           </w:rPr>
-          <w:t>https://hydroacoustics.usgs.gov/movingboat/QRev.shtml</w:t>
+          <w:t>www.genesishydrotech.com</w:t>
         </w:r>
       </w:hyperlink>
     </w:p>
@@ -202,7 +232,7 @@
           <w:rPr>
             <w:rStyle w:val="Hyperlink"/>
           </w:rPr>
-          <w:t>https://code.usgs.gov/QRev/QRevPy</w:t>
+          <w:t>https://bitbucket.org/genesishydrotech/qrevint</w:t>
         </w:r>
       </w:hyperlink>
     </w:p>
@@ -235,19 +265,118 @@
         <w:t>Disclaimer</w:t>
       </w:r>
       <w:r>
-        <w:t>: This software has been approved for release by the U.S. Geological Survey (USGS). Although the software has been subjected to rigorous review, the USGS reserves the right to update the software as needed pursuant to further analysis and review. No warranty, expressed or implied, is made by the USGS or the U.S. Government as to the functionality of the software and related material nor shall the fact of release constitute any such warranty. Furthermore, the software is released on condition that neither the USGS nor the U.S. Government shall be held liable for any damages resulting from its authorized or unauthorized use.</w:t>
-      </w:r>
-    </w:p>
-    <w:p>
-      <w:r>
-        <w:rPr>
-          <w:b/>
-          <w:bCs/>
-        </w:rPr>
-        <w:t>Copyright / License - CC0 1.0</w:t>
-      </w:r>
-      <w:r>
-        <w:t>: The person who associated a work with this deed has dedicated the work to the public domain by waiving all of his or her rights to the work worldwide under copyright law, including all related and neighboring rights, to the extent allowed by law. You can copy, modify, distribute and perform the work, even for commercial purposes, all without asking permission. </w:t>
+        <w:t xml:space="preserve">: </w:t>
+      </w:r>
+      <w:r>
+        <w:t>This software (</w:t>
+      </w:r>
+      <w:proofErr w:type="spellStart"/>
+      <w:r>
+        <w:t>QRevInt</w:t>
+      </w:r>
+      <w:proofErr w:type="spellEnd"/>
+      <w:r>
+        <w:t xml:space="preserve">) is a fork of </w:t>
+      </w:r>
+      <w:proofErr w:type="spellStart"/>
+      <w:r>
+        <w:t>QRev</w:t>
+      </w:r>
+      <w:proofErr w:type="spellEnd"/>
+      <w:r>
+        <w:t xml:space="preserve"> that was originally approved for release by the U.S. Geological Survey (USGS), IP-118174. Genesis </w:t>
+      </w:r>
+      <w:proofErr w:type="spellStart"/>
+      <w:r>
+        <w:t>HydroTech</w:t>
+      </w:r>
+      <w:proofErr w:type="spellEnd"/>
+      <w:r>
+        <w:t xml:space="preserve"> LLC through funding from various international agencies is working to improve and expand the capabilities and features available in </w:t>
+      </w:r>
+      <w:proofErr w:type="spellStart"/>
+      <w:r>
+        <w:t>QRevInt</w:t>
+      </w:r>
+      <w:proofErr w:type="spellEnd"/>
+      <w:r>
+        <w:t xml:space="preserve">. Although the software has been subjected to rigorous review, the software may be updated as needed pursuant to further analysis and review. No warranty, expressed or implied, is made by Genesis </w:t>
+      </w:r>
+      <w:proofErr w:type="spellStart"/>
+      <w:r>
+        <w:t>HydroTech</w:t>
+      </w:r>
+      <w:proofErr w:type="spellEnd"/>
+      <w:r>
+        <w:t xml:space="preserve"> LLC or any of the contributing agencies as to the functionality of the software and related material nor shall the fact of release constitute any such warranty. Furthermore, the software is released on condition that neither Genesis </w:t>
+      </w:r>
+      <w:proofErr w:type="spellStart"/>
+      <w:r>
+        <w:t>HydroTech</w:t>
+      </w:r>
+      <w:proofErr w:type="spellEnd"/>
+      <w:r>
+        <w:t xml:space="preserve"> LLC nor any of the participating agencies shall be held liable for any damages resulting from its authorized or unauthorized use.</w:t>
+      </w:r>
+    </w:p>
+    <w:p>
+      <w:r>
+        <w:rPr>
+          <w:b/>
+          <w:bCs/>
+        </w:rPr>
+        <w:t>License</w:t>
+      </w:r>
+      <w:r>
+        <w:t xml:space="preserve">: </w:t>
+      </w:r>
+      <w:r>
+        <w:t xml:space="preserve">Unless otherwise noted, </w:t>
+      </w:r>
+      <w:r>
+        <w:t>t</w:t>
+      </w:r>
+      <w:r>
+        <w:t xml:space="preserve">his project is in the public domain in the United States because it contains materials that originally came from the United States Geological Survey, an agency of the United States Department of Interior. For more information, see the official USGS copyright policy at </w:t>
+      </w:r>
+      <w:hyperlink r:id="rId9" w:history="1">
+        <w:r>
+          <w:rPr>
+            <w:rStyle w:val="Hyperlink"/>
+          </w:rPr>
+          <w:t>https://www.usgs.gov/information-policies-and-instructions/copyrights-and-credits</w:t>
+        </w:r>
+      </w:hyperlink>
+      <w:r>
+        <w:t>.</w:t>
+      </w:r>
+      <w:r>
+        <w:t xml:space="preserve"> Additionally, Genesis </w:t>
+      </w:r>
+      <w:proofErr w:type="spellStart"/>
+      <w:r>
+        <w:t>HydroTech</w:t>
+      </w:r>
+      <w:proofErr w:type="spellEnd"/>
+      <w:r>
+        <w:t xml:space="preserve"> LLC waives copyright and related rights in the work worldwide through the CC0 1.0 Universal public domain dedication.</w:t>
+      </w:r>
+    </w:p>
+    <w:p>
+      <w:r>
+        <w:t>3rd party code and libraries are covered by the copyright and license associated with those codes and libraries.</w:t>
+      </w:r>
+    </w:p>
+    <w:p>
+      <w:r>
+        <w:rPr>
+          <w:b/>
+          <w:bCs/>
+        </w:rPr>
+        <w:t>Copyright / License - CC0 1.0:</w:t>
+      </w:r>
+      <w:r>
+        <w:t xml:space="preserve"> The person who associated a work with this deed has dedicated the work to the public domain by waiving all of his or her rights to the work worldwide under copyright law, including all related and neighboring rights, to the extent allowed by law. You can copy, modify, distribute and perform the work, even for commercial purposes, all without asking permission. </w:t>
       </w:r>
     </w:p>
     <w:p>
@@ -271,6 +400,7 @@
           <w:b/>
           <w:bCs/>
         </w:rPr>
+        <w:lastRenderedPageBreak/>
         <w:t>Publicity or privacy</w:t>
       </w:r>
       <w:r>
@@ -283,10 +413,10 @@
           <w:b/>
           <w:bCs/>
         </w:rPr>
-        <w:t>Endorsement:</w:t>
-      </w:r>
-      <w:r>
-        <w:t xml:space="preserve"> In some jurisdictions, wrongfully implying that an author, publisher or anyone else endorses your use of a work may be unlawful.</w:t>
+        <w:t>Endorsement</w:t>
+      </w:r>
+      <w:r>
+        <w:t>: In some jurisdictions, wrongfully implying that an author, publisher or anyone else endorses your use of a work may be unlawful.</w:t>
       </w:r>
     </w:p>
     <w:sectPr>
@@ -300,7 +430,7 @@
 </file>
 
 <file path=word/styles.xml><?xml version="1.0" encoding="utf-8"?>
-<w:styles xmlns:mc="http://schemas.openxmlformats.org/markup-compatibility/2006" xmlns:r="http://schemas.openxmlformats.org/officeDocument/2006/relationships" xmlns:w="http://schemas.openxmlformats.org/wordprocessingml/2006/main" xmlns:w14="http://schemas.microsoft.com/office/word/2010/wordml" xmlns:w15="http://schemas.microsoft.com/office/word/2012/wordml" xmlns:w16cid="http://schemas.microsoft.com/office/word/2016/wordml/cid" xmlns:w16se="http://schemas.microsoft.com/office/word/2015/wordml/symex" mc:Ignorable="w14 w15 w16se w16cid">
+<w:styles xmlns:mc="http://schemas.openxmlformats.org/markup-compatibility/2006" xmlns:r="http://schemas.openxmlformats.org/officeDocument/2006/relationships" xmlns:w="http://schemas.openxmlformats.org/wordprocessingml/2006/main" xmlns:w14="http://schemas.microsoft.com/office/word/2010/wordml" xmlns:w15="http://schemas.microsoft.com/office/word/2012/wordml" xmlns:w16cex="http://schemas.microsoft.com/office/word/2018/wordml/cex" xmlns:w16cid="http://schemas.microsoft.com/office/word/2016/wordml/cid" xmlns:w16="http://schemas.microsoft.com/office/word/2018/wordml" xmlns:w16se="http://schemas.microsoft.com/office/word/2015/wordml/symex" mc:Ignorable="w14 w15 w16se w16cid w16 w16cex">
   <w:docDefaults>
     <w:rPrDefault>
       <w:rPr>

</xml_diff>

<commit_message>
Updated about and change log Fixed bug when on transect had all invalid gga Left version 1.00
</commit_message>
<xml_diff>
--- a/UI/Help/QRev_About.docx
+++ b/UI/Help/QRev_About.docx
@@ -110,21 +110,14 @@
           <w:b/>
           <w:bCs/>
         </w:rPr>
-        <w:t xml:space="preserve"> 4.</w:t>
-      </w:r>
-      <w:r>
-        <w:rPr>
-          <w:b/>
-          <w:bCs/>
-        </w:rPr>
-        <w:t>2</w:t>
-      </w:r>
-      <w:r>
-        <w:rPr>
-          <w:b/>
-          <w:bCs/>
-        </w:rPr>
-        <w:t>6 Beta</w:t>
+        <w:t xml:space="preserve"> </w:t>
+      </w:r>
+      <w:r>
+        <w:rPr>
+          <w:b/>
+          <w:bCs/>
+        </w:rPr>
+        <w:t>1.00</w:t>
       </w:r>
       <w:r>
         <w:rPr>
@@ -145,21 +138,21 @@
           <w:b/>
           <w:bCs/>
         </w:rPr>
-        <w:t>2/</w:t>
-      </w:r>
-      <w:r>
-        <w:rPr>
-          <w:b/>
-          <w:bCs/>
-        </w:rPr>
-        <w:t>1</w:t>
-      </w:r>
-      <w:r>
-        <w:rPr>
-          <w:b/>
-          <w:bCs/>
-        </w:rPr>
-        <w:t>1</w:t>
+        <w:t>3</w:t>
+      </w:r>
+      <w:r>
+        <w:rPr>
+          <w:b/>
+          <w:bCs/>
+        </w:rPr>
+        <w:t>/</w:t>
+      </w:r>
+      <w:r>
+        <w:rPr>
+          <w:b/>
+          <w:bCs/>
+        </w:rPr>
+        <w:t>4</w:t>
       </w:r>
       <w:r>
         <w:rPr>
@@ -284,7 +277,10 @@
       </w:r>
       <w:proofErr w:type="spellEnd"/>
       <w:r>
-        <w:t xml:space="preserve"> that was originally approved for release by the U.S. Geological Survey (USGS), IP-118174. Genesis </w:t>
+        <w:t>, which</w:t>
+      </w:r>
+      <w:r>
+        <w:t xml:space="preserve"> was originally approved for release by the U.S. Geological Survey (USGS), IP-118174. Genesis </w:t>
       </w:r>
       <w:proofErr w:type="spellStart"/>
       <w:r>
@@ -300,7 +296,7 @@
       </w:r>
       <w:proofErr w:type="spellEnd"/>
       <w:r>
-        <w:t xml:space="preserve">. Although the software has been subjected to rigorous review, the software may be updated as needed pursuant to further analysis and review. No warranty, expressed or implied, is made by Genesis </w:t>
+        <w:t xml:space="preserve">. While Genesis </w:t>
       </w:r>
       <w:proofErr w:type="spellStart"/>
       <w:r>
@@ -308,7 +304,7 @@
       </w:r>
       <w:proofErr w:type="spellEnd"/>
       <w:r>
-        <w:t xml:space="preserve"> LLC or any of the contributing agencies as to the functionality of the software and related material nor shall the fact of release constitute any such warranty. Furthermore, the software is released on condition that neither Genesis </w:t>
+        <w:t xml:space="preserve"> LLC makes every effort to deliver high quality products, Genesis </w:t>
       </w:r>
       <w:proofErr w:type="spellStart"/>
       <w:r>
@@ -316,7 +312,47 @@
       </w:r>
       <w:proofErr w:type="spellEnd"/>
       <w:r>
-        <w:t xml:space="preserve"> LLC nor any of the participating agencies shall be held liable for any damages resulting from its authorized or unauthorized use.</w:t>
+        <w:t xml:space="preserve"> LLC does not guarantee that the product is free from defects. </w:t>
+      </w:r>
+      <w:proofErr w:type="spellStart"/>
+      <w:r>
+        <w:t>QRevInt</w:t>
+      </w:r>
+      <w:proofErr w:type="spellEnd"/>
+      <w:r>
+        <w:t xml:space="preserve"> is provided “as is," and you use the software at your own risk. Genesis </w:t>
+      </w:r>
+      <w:proofErr w:type="spellStart"/>
+      <w:r>
+        <w:t>HydroTech</w:t>
+      </w:r>
+      <w:proofErr w:type="spellEnd"/>
+      <w:r>
+        <w:t xml:space="preserve"> LLC and contributing agencies make no warranties as to performance, merchantability, fitness for a particular purpose, or any other warranties whether expressed or implied. No oral or written communication from or information provided by Genesis </w:t>
+      </w:r>
+      <w:proofErr w:type="spellStart"/>
+      <w:r>
+        <w:t>HydroTech</w:t>
+      </w:r>
+      <w:proofErr w:type="spellEnd"/>
+      <w:r>
+        <w:t xml:space="preserve"> LLC or contributing agencies shall create a warranty. Under no circumstances shall Genesis </w:t>
+      </w:r>
+      <w:proofErr w:type="spellStart"/>
+      <w:r>
+        <w:t>HydroTech</w:t>
+      </w:r>
+      <w:proofErr w:type="spellEnd"/>
+      <w:r>
+        <w:t xml:space="preserve"> LLC or the contributing agencies be liable for direct, indirect, special, incidental, or consequential damages resulting from the use, misuse, or inability to use this software, even if Genesis </w:t>
+      </w:r>
+      <w:proofErr w:type="spellStart"/>
+      <w:r>
+        <w:t>HydroTech</w:t>
+      </w:r>
+      <w:proofErr w:type="spellEnd"/>
+      <w:r>
+        <w:t xml:space="preserve"> LLC or the contributing agencies have been advised of the possibility of such damages.</w:t>
       </w:r>
     </w:p>
     <w:p>
@@ -331,27 +367,7 @@
         <w:t xml:space="preserve">: </w:t>
       </w:r>
       <w:r>
-        <w:t xml:space="preserve">Unless otherwise noted, </w:t>
-      </w:r>
-      <w:r>
-        <w:t>t</w:t>
-      </w:r>
-      <w:r>
-        <w:t xml:space="preserve">his project is in the public domain in the United States because it contains materials that originally came from the United States Geological Survey, an agency of the United States Department of Interior. For more information, see the official USGS copyright policy at </w:t>
-      </w:r>
-      <w:hyperlink r:id="rId9" w:history="1">
-        <w:r>
-          <w:rPr>
-            <w:rStyle w:val="Hyperlink"/>
-          </w:rPr>
-          <w:t>https://www.usgs.gov/information-policies-and-instructions/copyrights-and-credits</w:t>
-        </w:r>
-      </w:hyperlink>
-      <w:r>
-        <w:t>.</w:t>
-      </w:r>
-      <w:r>
-        <w:t xml:space="preserve"> Additionally, Genesis </w:t>
+        <w:t xml:space="preserve">Unless otherwise noted, this project is in the public domain in the United States because it contains materials that originally came from the United States Geological Survey, an agency of the United States Department of Interior. For more information, see the official USGS copyright policy at https://www.usgs.gov/information-policies-and-instructions/copyrights-and-credits. Additionally, Genesis </w:t>
       </w:r>
       <w:proofErr w:type="spellStart"/>
       <w:r>
@@ -363,20 +379,25 @@
       </w:r>
     </w:p>
     <w:p>
-      <w:r>
-        <w:t>3rd party code and libraries are covered by the copyright and license associated with those codes and libraries.</w:t>
-      </w:r>
-    </w:p>
-    <w:p>
-      <w:r>
-        <w:rPr>
-          <w:b/>
-          <w:bCs/>
-        </w:rPr>
-        <w:t>Copyright / License - CC0 1.0:</w:t>
-      </w:r>
-      <w:r>
-        <w:t xml:space="preserve"> The person who associated a work with this deed has dedicated the work to the public domain by waiving all of his or her rights to the work worldwide under copyright law, including all related and neighboring rights, to the extent allowed by law. You can copy, modify, distribute and perform the work, even for commercial purposes, all without asking permission. </w:t>
+      <w:proofErr w:type="spellStart"/>
+      <w:r>
+        <w:t>QRevInt</w:t>
+      </w:r>
+      <w:proofErr w:type="spellEnd"/>
+      <w:r>
+        <w:t xml:space="preserve"> includes several open-source software packages. These open-source packages are governed by the terms and conditions of the applicable open-source license, and you are bound by the terms and conditions of the applicable open-source license in connection with your use and distribution of the open-source software in this product. </w:t>
+      </w:r>
+    </w:p>
+    <w:p>
+      <w:r>
+        <w:rPr>
+          <w:b/>
+          <w:bCs/>
+        </w:rPr>
+        <w:t>Copyright / License - CC0 1.0</w:t>
+      </w:r>
+      <w:r>
+        <w:t>: The person who associated a work with this deed has dedicated the work to the public domain by waiving all of his or her rights to the work worldwide under copyright law, including all related and neighboring rights, to the extent allowed by law. You can copy, modify, distribute, and perform the work, even for commercial purposes, all without asking permission. </w:t>
       </w:r>
     </w:p>
     <w:p>
@@ -386,6 +407,7 @@
     </w:p>
     <w:p>
       <w:r>
+        <w:lastRenderedPageBreak/>
         <w:t>Unless expressly stated otherwise, the person who associated a work with this deed makes no warranties about the work, and disclaims liability for all uses of the work, to the fullest extent permitted by applicable law.</w:t>
       </w:r>
     </w:p>
@@ -400,23 +422,10 @@
           <w:b/>
           <w:bCs/>
         </w:rPr>
-        <w:lastRenderedPageBreak/>
         <w:t>Publicity or privacy</w:t>
       </w:r>
       <w:r>
         <w:t>: The use of a work free of known copyright restrictions may be otherwise regulated or limited. The work or its use may be subject to personal data protection laws, publicity, image, or privacy rights that allow a person to control how their voice, image or likeness is used, or other restrictions or limitations under applicable law.</w:t>
-      </w:r>
-    </w:p>
-    <w:p>
-      <w:r>
-        <w:rPr>
-          <w:b/>
-          <w:bCs/>
-        </w:rPr>
-        <w:t>Endorsement</w:t>
-      </w:r>
-      <w:r>
-        <w:t>: In some jurisdictions, wrongfully implying that an author, publisher or anyone else endorses your use of a work may be unlawful.</w:t>
       </w:r>
     </w:p>
     <w:sectPr>

</xml_diff>

<commit_message>
Added QRev.cfg to repository Updated About document Released as 1.06
</commit_message>
<xml_diff>
--- a/UI/Help/QRev_About.docx
+++ b/UI/Help/QRev_About.docx
@@ -1,6 +1,6 @@
 
 <file path=word/document.xml><?xml version="1.0" encoding="utf-8"?>
-<w:document xmlns:wpc="http://schemas.microsoft.com/office/word/2010/wordprocessingCanvas" xmlns:cx="http://schemas.microsoft.com/office/drawing/2014/chartex" xmlns:cx1="http://schemas.microsoft.com/office/drawing/2015/9/8/chartex" xmlns:cx2="http://schemas.microsoft.com/office/drawing/2015/10/21/chartex" xmlns:cx3="http://schemas.microsoft.com/office/drawing/2016/5/9/chartex" xmlns:cx4="http://schemas.microsoft.com/office/drawing/2016/5/10/chartex" xmlns:cx5="http://schemas.microsoft.com/office/drawing/2016/5/11/chartex" xmlns:cx6="http://schemas.microsoft.com/office/drawing/2016/5/12/chartex" xmlns:cx7="http://schemas.microsoft.com/office/drawing/2016/5/13/chartex" xmlns:cx8="http://schemas.microsoft.com/office/drawing/2016/5/14/chartex" xmlns:mc="http://schemas.openxmlformats.org/markup-compatibility/2006" xmlns:aink="http://schemas.microsoft.com/office/drawing/2016/ink" xmlns:am3d="http://schemas.microsoft.com/office/drawing/2017/model3d" xmlns:o="urn:schemas-microsoft-com:office:office" xmlns:r="http://schemas.openxmlformats.org/officeDocument/2006/relationships" xmlns:m="http://schemas.openxmlformats.org/officeDocument/2006/math" xmlns:v="urn:schemas-microsoft-com:vml" xmlns:wp14="http://schemas.microsoft.com/office/word/2010/wordprocessingDrawing" xmlns:wp="http://schemas.openxmlformats.org/drawingml/2006/wordprocessingDrawing" xmlns:w10="urn:schemas-microsoft-com:office:word" xmlns:w="http://schemas.openxmlformats.org/wordprocessingml/2006/main" xmlns:w14="http://schemas.microsoft.com/office/word/2010/wordml" xmlns:w15="http://schemas.microsoft.com/office/word/2012/wordml" xmlns:w16cex="http://schemas.microsoft.com/office/word/2018/wordml/cex" xmlns:w16cid="http://schemas.microsoft.com/office/word/2016/wordml/cid" xmlns:w16="http://schemas.microsoft.com/office/word/2018/wordml" xmlns:w16se="http://schemas.microsoft.com/office/word/2015/wordml/symex" xmlns:wpg="http://schemas.microsoft.com/office/word/2010/wordprocessingGroup" xmlns:wpi="http://schemas.microsoft.com/office/word/2010/wordprocessingInk" xmlns:wne="http://schemas.microsoft.com/office/word/2006/wordml" xmlns:wps="http://schemas.microsoft.com/office/word/2010/wordprocessingShape" mc:Ignorable="w14 w15 w16se w16cid w16 w16cex wp14">
+<w:document xmlns:wpc="http://schemas.microsoft.com/office/word/2010/wordprocessingCanvas" xmlns:cx="http://schemas.microsoft.com/office/drawing/2014/chartex" xmlns:cx1="http://schemas.microsoft.com/office/drawing/2015/9/8/chartex" xmlns:cx2="http://schemas.microsoft.com/office/drawing/2015/10/21/chartex" xmlns:cx3="http://schemas.microsoft.com/office/drawing/2016/5/9/chartex" xmlns:cx4="http://schemas.microsoft.com/office/drawing/2016/5/10/chartex" xmlns:cx5="http://schemas.microsoft.com/office/drawing/2016/5/11/chartex" xmlns:cx6="http://schemas.microsoft.com/office/drawing/2016/5/12/chartex" xmlns:cx7="http://schemas.microsoft.com/office/drawing/2016/5/13/chartex" xmlns:cx8="http://schemas.microsoft.com/office/drawing/2016/5/14/chartex" xmlns:mc="http://schemas.openxmlformats.org/markup-compatibility/2006" xmlns:aink="http://schemas.microsoft.com/office/drawing/2016/ink" xmlns:am3d="http://schemas.microsoft.com/office/drawing/2017/model3d" xmlns:o="urn:schemas-microsoft-com:office:office" xmlns:r="http://schemas.openxmlformats.org/officeDocument/2006/relationships" xmlns:m="http://schemas.openxmlformats.org/officeDocument/2006/math" xmlns:v="urn:schemas-microsoft-com:vml" xmlns:wp14="http://schemas.microsoft.com/office/word/2010/wordprocessingDrawing" xmlns:wp="http://schemas.openxmlformats.org/drawingml/2006/wordprocessingDrawing" xmlns:w10="urn:schemas-microsoft-com:office:word" xmlns:w="http://schemas.openxmlformats.org/wordprocessingml/2006/main" xmlns:w14="http://schemas.microsoft.com/office/word/2010/wordml" xmlns:w15="http://schemas.microsoft.com/office/word/2012/wordml" xmlns:w16cex="http://schemas.microsoft.com/office/word/2018/wordml/cex" xmlns:w16cid="http://schemas.microsoft.com/office/word/2016/wordml/cid" xmlns:w16="http://schemas.microsoft.com/office/word/2018/wordml" xmlns:w16sdtdh="http://schemas.microsoft.com/office/word/2020/wordml/sdtdatahash" xmlns:w16se="http://schemas.microsoft.com/office/word/2015/wordml/symex" xmlns:wpg="http://schemas.microsoft.com/office/word/2010/wordprocessingGroup" xmlns:wpi="http://schemas.microsoft.com/office/word/2010/wordprocessingInk" xmlns:wne="http://schemas.microsoft.com/office/word/2006/wordml" xmlns:wps="http://schemas.microsoft.com/office/word/2010/wordprocessingShape" mc:Ignorable="w14 w15 w16se w16cid w16 w16cex w16sdtdh wp14">
   <w:body>
     <w:p>
       <w:pPr>
@@ -122,7 +122,7 @@
           <w:b/>
           <w:bCs/>
         </w:rPr>
-        <w:t>1</w:t>
+        <w:t>6</w:t>
       </w:r>
       <w:r>
         <w:rPr>
@@ -143,7 +143,7 @@
           <w:b/>
           <w:bCs/>
         </w:rPr>
-        <w:t>4</w:t>
+        <w:t>8</w:t>
       </w:r>
       <w:r>
         <w:rPr>
@@ -157,7 +157,7 @@
           <w:b/>
           <w:bCs/>
         </w:rPr>
-        <w:t>1</w:t>
+        <w:t>17</w:t>
       </w:r>
       <w:r>
         <w:rPr>
@@ -346,7 +346,7 @@
 </file>
 
 <file path=word/styles.xml><?xml version="1.0" encoding="utf-8"?>
-<w:styles xmlns:mc="http://schemas.openxmlformats.org/markup-compatibility/2006" xmlns:r="http://schemas.openxmlformats.org/officeDocument/2006/relationships" xmlns:w="http://schemas.openxmlformats.org/wordprocessingml/2006/main" xmlns:w14="http://schemas.microsoft.com/office/word/2010/wordml" xmlns:w15="http://schemas.microsoft.com/office/word/2012/wordml" xmlns:w16cex="http://schemas.microsoft.com/office/word/2018/wordml/cex" xmlns:w16cid="http://schemas.microsoft.com/office/word/2016/wordml/cid" xmlns:w16="http://schemas.microsoft.com/office/word/2018/wordml" xmlns:w16se="http://schemas.microsoft.com/office/word/2015/wordml/symex" mc:Ignorable="w14 w15 w16se w16cid w16 w16cex">
+<w:styles xmlns:mc="http://schemas.openxmlformats.org/markup-compatibility/2006" xmlns:r="http://schemas.openxmlformats.org/officeDocument/2006/relationships" xmlns:w="http://schemas.openxmlformats.org/wordprocessingml/2006/main" xmlns:w14="http://schemas.microsoft.com/office/word/2010/wordml" xmlns:w15="http://schemas.microsoft.com/office/word/2012/wordml" xmlns:w16cex="http://schemas.microsoft.com/office/word/2018/wordml/cex" xmlns:w16cid="http://schemas.microsoft.com/office/word/2016/wordml/cid" xmlns:w16="http://schemas.microsoft.com/office/word/2018/wordml" xmlns:w16sdtdh="http://schemas.microsoft.com/office/word/2020/wordml/sdtdatahash" xmlns:w16se="http://schemas.microsoft.com/office/word/2015/wordml/symex" mc:Ignorable="w14 w15 w16se w16cid w16 w16cex w16sdtdh">
   <w:docDefaults>
     <w:rPrDefault>
       <w:rPr>

</xml_diff>

<commit_message>
AdvGraphs: 1) modified some axis labels, 2) fixed bugs with WT time series plots and invalid data, 3) fixed bug with BT time series data and invalid data.
Updated all documentation.
</commit_message>
<xml_diff>
--- a/UI/Help/QRev_About.docx
+++ b/UI/Help/QRev_About.docx
@@ -122,7 +122,7 @@
           <w:b/>
           <w:bCs/>
         </w:rPr>
-        <w:t>6</w:t>
+        <w:t>7</w:t>
       </w:r>
       <w:r>
         <w:rPr>
@@ -157,7 +157,7 @@
           <w:b/>
           <w:bCs/>
         </w:rPr>
-        <w:t>17</w:t>
+        <w:t>31</w:t>
       </w:r>
       <w:r>
         <w:rPr>

</xml_diff>

<commit_message>
Measurement: 1) fixed bug loading RS5 data with blank Operator and/or Measurement Number, 2) fixed bug loading a QRev.mat file saved from processing an older QRev.mat file
Updated documentation

OpenMeasurementDialog: 1) modified to allow use of path provided by parent instead of only the sticky settings Folder.

QRev: 1) added path attribute to prevent simultaneous instances of QRev from sharing / changing the default path, 2) added code to support addition of Default X-Axis to Options dialog, 3) fixed bug in Heading source dialog if no selection made, 4) fixed bug in temperature source dialog if user temp left blank, 5) fixed bug in salinity dialog if edit box left blank, 6) fixed bug in speed of sound dialog if left blank.

selectFile: 1) modified to allow use of path provided by parent instead of only the sticky settings Folder.

wOptions: 1) added Default X-Axis options
</commit_message>
<xml_diff>
--- a/UI/Help/QRev_About.docx
+++ b/UI/Help/QRev_About.docx
@@ -70,6 +70,7 @@
         </w:rPr>
         <w:t xml:space="preserve"> </w:t>
       </w:r>
+      <w:proofErr w:type="spellStart"/>
       <w:r>
         <w:rPr>
           <w:b/>
@@ -88,6 +89,7 @@
         </w:rPr>
         <w:t>Int</w:t>
       </w:r>
+      <w:proofErr w:type="spellEnd"/>
     </w:p>
     <w:p>
       <w:pPr>
@@ -122,7 +124,7 @@
           <w:b/>
           <w:bCs/>
         </w:rPr>
-        <w:t>7</w:t>
+        <w:t>8</w:t>
       </w:r>
       <w:r>
         <w:rPr>
@@ -143,7 +145,7 @@
           <w:b/>
           <w:bCs/>
         </w:rPr>
-        <w:t>8</w:t>
+        <w:t>9</w:t>
       </w:r>
       <w:r>
         <w:rPr>
@@ -157,7 +159,14 @@
           <w:b/>
           <w:bCs/>
         </w:rPr>
-        <w:t>31</w:t>
+        <w:t>3</w:t>
+      </w:r>
+      <w:r>
+        <w:rPr>
+          <w:b/>
+          <w:bCs/>
+        </w:rPr>
+        <w:t>0</w:t>
       </w:r>
       <w:r>
         <w:rPr>
@@ -266,13 +275,98 @@
         <w:t xml:space="preserve">: </w:t>
       </w:r>
       <w:r>
-        <w:t>This software (QRevInt) is a fork of QRev</w:t>
-      </w:r>
+        <w:t>This software (</w:t>
+      </w:r>
+      <w:proofErr w:type="spellStart"/>
+      <w:r>
+        <w:t>QRevInt</w:t>
+      </w:r>
+      <w:proofErr w:type="spellEnd"/>
+      <w:r>
+        <w:t xml:space="preserve">) is a fork of </w:t>
+      </w:r>
+      <w:proofErr w:type="spellStart"/>
+      <w:r>
+        <w:t>QRev</w:t>
+      </w:r>
+      <w:proofErr w:type="spellEnd"/>
       <w:r>
         <w:t>, which</w:t>
       </w:r>
       <w:r>
-        <w:t xml:space="preserve"> was originally approved for release by the U.S. Geological Survey (USGS), IP-118174. Genesis HydroTech LLC through funding from various international agencies is working to improve and expand the capabilities and features available in QRevInt. While Genesis HydroTech LLC makes every effort to deliver high quality products, Genesis HydroTech LLC does not guarantee that the product is free from defects. QRevInt is provided “as is," and you use the software at your own risk. Genesis HydroTech LLC and contributing agencies make no warranties as to performance, merchantability, fitness for a particular purpose, or any other warranties whether expressed or implied. No oral or written communication from or information provided by Genesis HydroTech LLC or contributing agencies shall create a warranty. Under no circumstances shall Genesis HydroTech LLC or the contributing agencies be liable for direct, indirect, special, incidental, or consequential damages resulting from the use, misuse, or inability to use this software, even if Genesis HydroTech LLC or the contributing agencies have been advised of the possibility of such damages.</w:t>
+        <w:t xml:space="preserve"> was originally approved for release by the U.S. Geological Survey (USGS), IP-118174. Genesis </w:t>
+      </w:r>
+      <w:proofErr w:type="spellStart"/>
+      <w:r>
+        <w:t>HydroTech</w:t>
+      </w:r>
+      <w:proofErr w:type="spellEnd"/>
+      <w:r>
+        <w:t xml:space="preserve"> LLC through funding from various international agencies is working to improve and expand the capabilities and features available in </w:t>
+      </w:r>
+      <w:proofErr w:type="spellStart"/>
+      <w:r>
+        <w:t>QRevInt</w:t>
+      </w:r>
+      <w:proofErr w:type="spellEnd"/>
+      <w:r>
+        <w:t xml:space="preserve">. While Genesis </w:t>
+      </w:r>
+      <w:proofErr w:type="spellStart"/>
+      <w:r>
+        <w:t>HydroTech</w:t>
+      </w:r>
+      <w:proofErr w:type="spellEnd"/>
+      <w:r>
+        <w:t xml:space="preserve"> LLC makes every effort to deliver high quality products, Genesis </w:t>
+      </w:r>
+      <w:proofErr w:type="spellStart"/>
+      <w:r>
+        <w:t>HydroTech</w:t>
+      </w:r>
+      <w:proofErr w:type="spellEnd"/>
+      <w:r>
+        <w:t xml:space="preserve"> LLC does not guarantee that the product is free from defects. </w:t>
+      </w:r>
+      <w:proofErr w:type="spellStart"/>
+      <w:r>
+        <w:t>QRevInt</w:t>
+      </w:r>
+      <w:proofErr w:type="spellEnd"/>
+      <w:r>
+        <w:t xml:space="preserve"> is provided “as is," and you use the software at your own risk. Genesis </w:t>
+      </w:r>
+      <w:proofErr w:type="spellStart"/>
+      <w:r>
+        <w:t>HydroTech</w:t>
+      </w:r>
+      <w:proofErr w:type="spellEnd"/>
+      <w:r>
+        <w:t xml:space="preserve"> LLC and contributing agencies make no warranties as to performance, merchantability, fitness for a particular purpose, or any other warranties whether expressed or implied. No oral or written communication from or information provided by Genesis </w:t>
+      </w:r>
+      <w:proofErr w:type="spellStart"/>
+      <w:r>
+        <w:t>HydroTech</w:t>
+      </w:r>
+      <w:proofErr w:type="spellEnd"/>
+      <w:r>
+        <w:t xml:space="preserve"> LLC or contributing agencies shall create a warranty. Under no circumstances shall Genesis </w:t>
+      </w:r>
+      <w:proofErr w:type="spellStart"/>
+      <w:r>
+        <w:t>HydroTech</w:t>
+      </w:r>
+      <w:proofErr w:type="spellEnd"/>
+      <w:r>
+        <w:t xml:space="preserve"> LLC or the contributing agencies be liable for direct, indirect, special, incidental, or consequential damages resulting from the use, misuse, or inability to use this software, even if Genesis </w:t>
+      </w:r>
+      <w:proofErr w:type="spellStart"/>
+      <w:r>
+        <w:t>HydroTech</w:t>
+      </w:r>
+      <w:proofErr w:type="spellEnd"/>
+      <w:r>
+        <w:t xml:space="preserve"> LLC or the contributing agencies have been advised of the possibility of such damages.</w:t>
       </w:r>
     </w:p>
     <w:p>
@@ -287,12 +381,25 @@
         <w:t xml:space="preserve">: </w:t>
       </w:r>
       <w:r>
-        <w:t>Unless otherwise noted, this project is in the public domain in the United States because it contains materials that originally came from the United States Geological Survey, an agency of the United States Department of Interior. For more information, see the official USGS copyright policy at https://www.usgs.gov/information-policies-and-instructions/copyrights-and-credits. Additionally, Genesis HydroTech LLC waives copyright and related rights in the work worldwide through the CC0 1.0 Universal public domain dedication.</w:t>
-      </w:r>
-    </w:p>
-    <w:p>
-      <w:r>
-        <w:t xml:space="preserve">QRevInt includes several open-source software packages. These open-source packages are governed by the terms and conditions of the applicable open-source license, and you are bound by the terms and conditions of the applicable open-source license in connection with your use and distribution of the open-source software in this product. </w:t>
+        <w:t xml:space="preserve">Unless otherwise noted, this project is in the public domain in the United States because it contains materials that originally came from the United States Geological Survey, an agency of the United States Department of Interior. For more information, see the official USGS copyright policy at https://www.usgs.gov/information-policies-and-instructions/copyrights-and-credits. Additionally, Genesis </w:t>
+      </w:r>
+      <w:proofErr w:type="spellStart"/>
+      <w:r>
+        <w:t>HydroTech</w:t>
+      </w:r>
+      <w:proofErr w:type="spellEnd"/>
+      <w:r>
+        <w:t xml:space="preserve"> LLC waives copyright and related rights in the work worldwide through the CC0 1.0 Universal public domain dedication.</w:t>
+      </w:r>
+    </w:p>
+    <w:p>
+      <w:proofErr w:type="spellStart"/>
+      <w:r>
+        <w:t>QRevInt</w:t>
+      </w:r>
+      <w:proofErr w:type="spellEnd"/>
+      <w:r>
+        <w:t xml:space="preserve"> includes several open-source software packages. These open-source packages are governed by the terms and conditions of the applicable open-source license, and you are bound by the terms and conditions of the applicable open-source license in connection with your use and distribution of the open-source software in this product. </w:t>
       </w:r>
     </w:p>
     <w:p>
@@ -304,7 +411,15 @@
         <w:t>Copyright / License - CC0 1.0</w:t>
       </w:r>
       <w:r>
-        <w:t>: The person who associated a work with this deed has dedicated the work to the public domain by waiving all of his or her rights to the work worldwide under copyright law, including all related and neighboring rights, to the extent allowed by law. You can copy, modify, distribute, and perform the work, even for commercial purposes, all without asking permission. </w:t>
+        <w:t xml:space="preserve">: The person who associated a work with this deed has dedicated the work to the public domain by waiving </w:t>
+      </w:r>
+      <w:proofErr w:type="gramStart"/>
+      <w:r>
+        <w:t>all of</w:t>
+      </w:r>
+      <w:proofErr w:type="gramEnd"/>
+      <w:r>
+        <w:t xml:space="preserve"> his or her rights to the work worldwide under copyright law, including all related and neighboring rights, to the extent allowed by law. You can copy, modify, distribute, and perform the work, even for commercial purposes, all without asking permission. </w:t>
       </w:r>
     </w:p>
     <w:p>

</xml_diff>

<commit_message>
Measurement: 1) moved stage start, end, and measurement for Other node to Site Info. QRev: 1) changed version to 1.09 Updated documentation
</commit_message>
<xml_diff>
--- a/UI/Help/QRev_About.docx
+++ b/UI/Help/QRev_About.docx
@@ -124,7 +124,7 @@
           <w:b/>
           <w:bCs/>
         </w:rPr>
-        <w:t>8</w:t>
+        <w:t>9</w:t>
       </w:r>
       <w:r>
         <w:rPr>
@@ -145,28 +145,7 @@
           <w:b/>
           <w:bCs/>
         </w:rPr>
-        <w:t>9</w:t>
-      </w:r>
-      <w:r>
-        <w:rPr>
-          <w:b/>
-          <w:bCs/>
-        </w:rPr>
-        <w:t>/</w:t>
-      </w:r>
-      <w:r>
-        <w:rPr>
-          <w:b/>
-          <w:bCs/>
-        </w:rPr>
-        <w:t>3</w:t>
-      </w:r>
-      <w:r>
-        <w:rPr>
-          <w:b/>
-          <w:bCs/>
-        </w:rPr>
-        <w:t>0</w:t>
+        <w:t>10/11</w:t>
       </w:r>
       <w:r>
         <w:rPr>

</xml_diff>

<commit_message>
MatSonTek: 1) modified code to capture files with no data Measurement: 1) modified code to capture SonTek Matlab files with no data and add comment AdvGraphs: 1) fixed bug causing crash when SonTek data had missing samples and SNR graph was viewed OpenMeasurementDialog: 1) modified code to capture SonTek Matlab files with no data and add comment
Changed version to 1.10
</commit_message>
<xml_diff>
--- a/UI/Help/QRev_About.docx
+++ b/UI/Help/QRev_About.docx
@@ -70,7 +70,6 @@
         </w:rPr>
         <w:t xml:space="preserve"> </w:t>
       </w:r>
-      <w:proofErr w:type="spellStart"/>
       <w:r>
         <w:rPr>
           <w:b/>
@@ -89,7 +88,6 @@
         </w:rPr>
         <w:t>Int</w:t>
       </w:r>
-      <w:proofErr w:type="spellEnd"/>
     </w:p>
     <w:p>
       <w:pPr>
@@ -117,14 +115,14 @@
           <w:b/>
           <w:bCs/>
         </w:rPr>
-        <w:t>1.0</w:t>
-      </w:r>
-      <w:r>
-        <w:rPr>
-          <w:b/>
-          <w:bCs/>
-        </w:rPr>
-        <w:t>9</w:t>
+        <w:t>1.</w:t>
+      </w:r>
+      <w:r>
+        <w:rPr>
+          <w:b/>
+          <w:bCs/>
+        </w:rPr>
+        <w:t>10</w:t>
       </w:r>
       <w:r>
         <w:rPr>
@@ -145,7 +143,28 @@
           <w:b/>
           <w:bCs/>
         </w:rPr>
-        <w:t>10/11</w:t>
+        <w:t>1</w:t>
+      </w:r>
+      <w:r>
+        <w:rPr>
+          <w:b/>
+          <w:bCs/>
+        </w:rPr>
+        <w:t>1</w:t>
+      </w:r>
+      <w:r>
+        <w:rPr>
+          <w:b/>
+          <w:bCs/>
+        </w:rPr>
+        <w:t>/</w:t>
+      </w:r>
+      <w:r>
+        <w:rPr>
+          <w:b/>
+          <w:bCs/>
+        </w:rPr>
+        <w:t>04</w:t>
       </w:r>
       <w:r>
         <w:rPr>
@@ -254,98 +273,13 @@
         <w:t xml:space="preserve">: </w:t>
       </w:r>
       <w:r>
-        <w:t>This software (</w:t>
-      </w:r>
-      <w:proofErr w:type="spellStart"/>
-      <w:r>
-        <w:t>QRevInt</w:t>
-      </w:r>
-      <w:proofErr w:type="spellEnd"/>
-      <w:r>
-        <w:t xml:space="preserve">) is a fork of </w:t>
-      </w:r>
-      <w:proofErr w:type="spellStart"/>
-      <w:r>
-        <w:t>QRev</w:t>
-      </w:r>
-      <w:proofErr w:type="spellEnd"/>
+        <w:t>This software (QRevInt) is a fork of QRev</w:t>
+      </w:r>
       <w:r>
         <w:t>, which</w:t>
       </w:r>
       <w:r>
-        <w:t xml:space="preserve"> was originally approved for release by the U.S. Geological Survey (USGS), IP-118174. Genesis </w:t>
-      </w:r>
-      <w:proofErr w:type="spellStart"/>
-      <w:r>
-        <w:t>HydroTech</w:t>
-      </w:r>
-      <w:proofErr w:type="spellEnd"/>
-      <w:r>
-        <w:t xml:space="preserve"> LLC through funding from various international agencies is working to improve and expand the capabilities and features available in </w:t>
-      </w:r>
-      <w:proofErr w:type="spellStart"/>
-      <w:r>
-        <w:t>QRevInt</w:t>
-      </w:r>
-      <w:proofErr w:type="spellEnd"/>
-      <w:r>
-        <w:t xml:space="preserve">. While Genesis </w:t>
-      </w:r>
-      <w:proofErr w:type="spellStart"/>
-      <w:r>
-        <w:t>HydroTech</w:t>
-      </w:r>
-      <w:proofErr w:type="spellEnd"/>
-      <w:r>
-        <w:t xml:space="preserve"> LLC makes every effort to deliver high quality products, Genesis </w:t>
-      </w:r>
-      <w:proofErr w:type="spellStart"/>
-      <w:r>
-        <w:t>HydroTech</w:t>
-      </w:r>
-      <w:proofErr w:type="spellEnd"/>
-      <w:r>
-        <w:t xml:space="preserve"> LLC does not guarantee that the product is free from defects. </w:t>
-      </w:r>
-      <w:proofErr w:type="spellStart"/>
-      <w:r>
-        <w:t>QRevInt</w:t>
-      </w:r>
-      <w:proofErr w:type="spellEnd"/>
-      <w:r>
-        <w:t xml:space="preserve"> is provided “as is," and you use the software at your own risk. Genesis </w:t>
-      </w:r>
-      <w:proofErr w:type="spellStart"/>
-      <w:r>
-        <w:t>HydroTech</w:t>
-      </w:r>
-      <w:proofErr w:type="spellEnd"/>
-      <w:r>
-        <w:t xml:space="preserve"> LLC and contributing agencies make no warranties as to performance, merchantability, fitness for a particular purpose, or any other warranties whether expressed or implied. No oral or written communication from or information provided by Genesis </w:t>
-      </w:r>
-      <w:proofErr w:type="spellStart"/>
-      <w:r>
-        <w:t>HydroTech</w:t>
-      </w:r>
-      <w:proofErr w:type="spellEnd"/>
-      <w:r>
-        <w:t xml:space="preserve"> LLC or contributing agencies shall create a warranty. Under no circumstances shall Genesis </w:t>
-      </w:r>
-      <w:proofErr w:type="spellStart"/>
-      <w:r>
-        <w:t>HydroTech</w:t>
-      </w:r>
-      <w:proofErr w:type="spellEnd"/>
-      <w:r>
-        <w:t xml:space="preserve"> LLC or the contributing agencies be liable for direct, indirect, special, incidental, or consequential damages resulting from the use, misuse, or inability to use this software, even if Genesis </w:t>
-      </w:r>
-      <w:proofErr w:type="spellStart"/>
-      <w:r>
-        <w:t>HydroTech</w:t>
-      </w:r>
-      <w:proofErr w:type="spellEnd"/>
-      <w:r>
-        <w:t xml:space="preserve"> LLC or the contributing agencies have been advised of the possibility of such damages.</w:t>
+        <w:t xml:space="preserve"> was originally approved for release by the U.S. Geological Survey (USGS), IP-118174. Genesis HydroTech LLC through funding from various international agencies is working to improve and expand the capabilities and features available in QRevInt. While Genesis HydroTech LLC makes every effort to deliver high quality products, Genesis HydroTech LLC does not guarantee that the product is free from defects. QRevInt is provided “as is," and you use the software at your own risk. Genesis HydroTech LLC and contributing agencies make no warranties as to performance, merchantability, fitness for a particular purpose, or any other warranties whether expressed or implied. No oral or written communication from or information provided by Genesis HydroTech LLC or contributing agencies shall create a warranty. Under no circumstances shall Genesis HydroTech LLC or the contributing agencies be liable for direct, indirect, special, incidental, or consequential damages resulting from the use, misuse, or inability to use this software, even if Genesis HydroTech LLC or the contributing agencies have been advised of the possibility of such damages.</w:t>
       </w:r>
     </w:p>
     <w:p>
@@ -360,25 +294,12 @@
         <w:t xml:space="preserve">: </w:t>
       </w:r>
       <w:r>
-        <w:t xml:space="preserve">Unless otherwise noted, this project is in the public domain in the United States because it contains materials that originally came from the United States Geological Survey, an agency of the United States Department of Interior. For more information, see the official USGS copyright policy at https://www.usgs.gov/information-policies-and-instructions/copyrights-and-credits. Additionally, Genesis </w:t>
-      </w:r>
-      <w:proofErr w:type="spellStart"/>
-      <w:r>
-        <w:t>HydroTech</w:t>
-      </w:r>
-      <w:proofErr w:type="spellEnd"/>
-      <w:r>
-        <w:t xml:space="preserve"> LLC waives copyright and related rights in the work worldwide through the CC0 1.0 Universal public domain dedication.</w:t>
-      </w:r>
-    </w:p>
-    <w:p>
-      <w:proofErr w:type="spellStart"/>
-      <w:r>
-        <w:t>QRevInt</w:t>
-      </w:r>
-      <w:proofErr w:type="spellEnd"/>
-      <w:r>
-        <w:t xml:space="preserve"> includes several open-source software packages. These open-source packages are governed by the terms and conditions of the applicable open-source license, and you are bound by the terms and conditions of the applicable open-source license in connection with your use and distribution of the open-source software in this product. </w:t>
+        <w:t>Unless otherwise noted, this project is in the public domain in the United States because it contains materials that originally came from the United States Geological Survey, an agency of the United States Department of Interior. For more information, see the official USGS copyright policy at https://www.usgs.gov/information-policies-and-instructions/copyrights-and-credits. Additionally, Genesis HydroTech LLC waives copyright and related rights in the work worldwide through the CC0 1.0 Universal public domain dedication.</w:t>
+      </w:r>
+    </w:p>
+    <w:p>
+      <w:r>
+        <w:t xml:space="preserve">QRevInt includes several open-source software packages. These open-source packages are governed by the terms and conditions of the applicable open-source license, and you are bound by the terms and conditions of the applicable open-source license in connection with your use and distribution of the open-source software in this product. </w:t>
       </w:r>
     </w:p>
     <w:p>
@@ -390,15 +311,7 @@
         <w:t>Copyright / License - CC0 1.0</w:t>
       </w:r>
       <w:r>
-        <w:t xml:space="preserve">: The person who associated a work with this deed has dedicated the work to the public domain by waiving </w:t>
-      </w:r>
-      <w:proofErr w:type="gramStart"/>
-      <w:r>
-        <w:t>all of</w:t>
-      </w:r>
-      <w:proofErr w:type="gramEnd"/>
-      <w:r>
-        <w:t xml:space="preserve"> his or her rights to the work worldwide under copyright law, including all related and neighboring rights, to the extent allowed by law. You can copy, modify, distribute, and perform the work, even for commercial purposes, all without asking permission. </w:t>
+        <w:t>: The person who associated a work with this deed has dedicated the work to the public domain by waiving all of his or her rights to the work worldwide under copyright law, including all related and neighboring rights, to the extent allowed by law. You can copy, modify, distribute, and perform the work, even for commercial purposes, all without asking permission. </w:t>
       </w:r>
     </w:p>
     <w:p>

</xml_diff>

<commit_message>
OpenMeasurementDialog: 1) modified code to prevent crash when opening incomplete SonTek *.mat files
QRev: 1) changed version 1.11

wOptions: 1) Added scroll bar if dialog needs to be made smaller.
</commit_message>
<xml_diff>
--- a/UI/Help/QRev_About.docx
+++ b/UI/Help/QRev_About.docx
@@ -122,7 +122,14 @@
           <w:b/>
           <w:bCs/>
         </w:rPr>
-        <w:t>10</w:t>
+        <w:t>1</w:t>
+      </w:r>
+      <w:r>
+        <w:rPr>
+          <w:b/>
+          <w:bCs/>
+        </w:rPr>
+        <w:t>1</w:t>
       </w:r>
       <w:r>
         <w:rPr>
@@ -164,7 +171,7 @@
           <w:b/>
           <w:bCs/>
         </w:rPr>
-        <w:t>04</w:t>
+        <w:t>15</w:t>
       </w:r>
       <w:r>
         <w:rPr>

</xml_diff>

<commit_message>
stickysettings.py: 1) fixed spelling error in comment
QRev: 1) fixed bug preventing execution if QRev Settings file was not previously defined with the Folder key, 2) changed version to 1.15.

Updated About
Updated Change Log
</commit_message>
<xml_diff>
--- a/UI/Help/QRev_About.docx
+++ b/UI/Help/QRev_About.docx
@@ -129,7 +129,7 @@
           <w:b/>
           <w:bCs/>
         </w:rPr>
-        <w:t>4</w:t>
+        <w:t>5</w:t>
       </w:r>
       <w:r>
         <w:rPr>
@@ -150,7 +150,28 @@
           <w:b/>
           <w:bCs/>
         </w:rPr>
-        <w:t>1/18/2022</w:t>
+        <w:t>2</w:t>
+      </w:r>
+      <w:r>
+        <w:rPr>
+          <w:b/>
+          <w:bCs/>
+        </w:rPr>
+        <w:t>/1</w:t>
+      </w:r>
+      <w:r>
+        <w:rPr>
+          <w:b/>
+          <w:bCs/>
+        </w:rPr>
+        <w:t>0</w:t>
+      </w:r>
+      <w:r>
+        <w:rPr>
+          <w:b/>
+          <w:bCs/>
+        </w:rPr>
+        <w:t>/2022</w:t>
       </w:r>
     </w:p>
     <w:p>

</xml_diff>

<commit_message>
OpenMeasurementDialog: 1) fixed bug causing crash if QRev Settings didn't exist. QRev: 1) changed version to 1.16 Updated Change Log and About
</commit_message>
<xml_diff>
--- a/UI/Help/QRev_About.docx
+++ b/UI/Help/QRev_About.docx
@@ -129,7 +129,7 @@
           <w:b/>
           <w:bCs/>
         </w:rPr>
-        <w:t>5</w:t>
+        <w:t>7</w:t>
       </w:r>
       <w:r>
         <w:rPr>
@@ -164,7 +164,7 @@
           <w:b/>
           <w:bCs/>
         </w:rPr>
-        <w:t>0</w:t>
+        <w:t>1</w:t>
       </w:r>
       <w:r>
         <w:rPr>

</xml_diff>

<commit_message>
Changed to version 1.18 1.	Fixed bug so that the uncertainty value from the selected uncertainty model is recorded in the comments.
</commit_message>
<xml_diff>
--- a/UI/Help/QRev_About.docx
+++ b/UI/Help/QRev_About.docx
@@ -129,7 +129,7 @@
           <w:b/>
           <w:bCs/>
         </w:rPr>
-        <w:t>7</w:t>
+        <w:t>8</w:t>
       </w:r>
       <w:r>
         <w:rPr>
@@ -158,6 +158,13 @@
           <w:bCs/>
         </w:rPr>
         <w:t>/</w:t>
+      </w:r>
+      <w:r>
+        <w:rPr>
+          <w:b/>
+          <w:bCs/>
+        </w:rPr>
+        <w:t>2</w:t>
       </w:r>
       <w:r>
         <w:rPr>
@@ -266,13 +273,74 @@
         <w:t xml:space="preserve">: </w:t>
       </w:r>
       <w:r>
-        <w:t>This software (QRevInt) is a fork of QRev</w:t>
-      </w:r>
+        <w:t xml:space="preserve">This software (QRevInt) is a fork of </w:t>
+      </w:r>
+      <w:proofErr w:type="spellStart"/>
+      <w:r>
+        <w:t>QRev</w:t>
+      </w:r>
+      <w:proofErr w:type="spellEnd"/>
       <w:r>
         <w:t>, which</w:t>
       </w:r>
       <w:r>
-        <w:t xml:space="preserve"> was originally approved for release by the U.S. Geological Survey (USGS), IP-118174. Genesis HydroTech LLC through funding from various international agencies is working to improve and expand the capabilities and features available in QRevInt. While Genesis HydroTech LLC makes every effort to deliver high quality products, Genesis HydroTech LLC does not guarantee that the product is free from defects. QRevInt is provided “as is," and you use the software at your own risk. Genesis HydroTech LLC and contributing agencies make no warranties as to performance, merchantability, fitness for a particular purpose, or any other warranties whether expressed or implied. No oral or written communication from or information provided by Genesis HydroTech LLC or contributing agencies shall create a warranty. Under no circumstances shall Genesis HydroTech LLC or the contributing agencies be liable for direct, indirect, special, incidental, or consequential damages resulting from the use, misuse, or inability to use this software, even if Genesis HydroTech LLC or the contributing agencies have been advised of the possibility of such damages.</w:t>
+        <w:t xml:space="preserve"> was originally approved for release by the U.S. Geological Survey (USGS), IP-118174. Genesis </w:t>
+      </w:r>
+      <w:proofErr w:type="spellStart"/>
+      <w:r>
+        <w:t>HydroTech</w:t>
+      </w:r>
+      <w:proofErr w:type="spellEnd"/>
+      <w:r>
+        <w:t xml:space="preserve"> LLC through funding from various international agencies is working to improve and expand the capabilities and features available in QRevInt. While Genesis </w:t>
+      </w:r>
+      <w:proofErr w:type="spellStart"/>
+      <w:r>
+        <w:t>HydroTech</w:t>
+      </w:r>
+      <w:proofErr w:type="spellEnd"/>
+      <w:r>
+        <w:t xml:space="preserve"> LLC makes every effort to deliver high quality products, Genesis </w:t>
+      </w:r>
+      <w:proofErr w:type="spellStart"/>
+      <w:r>
+        <w:t>HydroTech</w:t>
+      </w:r>
+      <w:proofErr w:type="spellEnd"/>
+      <w:r>
+        <w:t xml:space="preserve"> LLC does not guarantee that the product is free from defects. QRevInt is provided “as is," and you use the software at your own risk. Genesis </w:t>
+      </w:r>
+      <w:proofErr w:type="spellStart"/>
+      <w:r>
+        <w:t>HydroTech</w:t>
+      </w:r>
+      <w:proofErr w:type="spellEnd"/>
+      <w:r>
+        <w:t xml:space="preserve"> LLC and contributing agencies make no warranties as to performance, merchantability, fitness for a particular purpose, or any other warranties whether expressed or implied. No oral or written communication from or information provided by Genesis </w:t>
+      </w:r>
+      <w:proofErr w:type="spellStart"/>
+      <w:r>
+        <w:t>HydroTech</w:t>
+      </w:r>
+      <w:proofErr w:type="spellEnd"/>
+      <w:r>
+        <w:t xml:space="preserve"> LLC or contributing agencies shall create a warranty. Under no circumstances shall Genesis </w:t>
+      </w:r>
+      <w:proofErr w:type="spellStart"/>
+      <w:r>
+        <w:t>HydroTech</w:t>
+      </w:r>
+      <w:proofErr w:type="spellEnd"/>
+      <w:r>
+        <w:t xml:space="preserve"> LLC or the contributing agencies be liable for direct, indirect, special, incidental, or consequential damages resulting from the use, misuse, or inability to use this software, even if Genesis </w:t>
+      </w:r>
+      <w:proofErr w:type="spellStart"/>
+      <w:r>
+        <w:t>HydroTech</w:t>
+      </w:r>
+      <w:proofErr w:type="spellEnd"/>
+      <w:r>
+        <w:t xml:space="preserve"> LLC or the contributing agencies have been advised of the possibility of such damages.</w:t>
       </w:r>
     </w:p>
     <w:p>
@@ -287,7 +355,15 @@
         <w:t xml:space="preserve">: </w:t>
       </w:r>
       <w:r>
-        <w:t>Unless otherwise noted, this project is in the public domain in the United States because it contains materials that originally came from the United States Geological Survey, an agency of the United States Department of Interior. For more information, see the official USGS copyright policy at https://www.usgs.gov/information-policies-and-instructions/copyrights-and-credits. Additionally, Genesis HydroTech LLC waives copyright and related rights in the work worldwide through the CC0 1.0 Universal public domain dedication.</w:t>
+        <w:t xml:space="preserve">Unless otherwise noted, this project is in the public domain in the United States because it contains materials that originally came from the United States Geological Survey, an agency of the United States Department of Interior. For more information, see the official USGS copyright policy at https://www.usgs.gov/information-policies-and-instructions/copyrights-and-credits. Additionally, Genesis </w:t>
+      </w:r>
+      <w:proofErr w:type="spellStart"/>
+      <w:r>
+        <w:t>HydroTech</w:t>
+      </w:r>
+      <w:proofErr w:type="spellEnd"/>
+      <w:r>
+        <w:t xml:space="preserve"> LLC waives copyright and related rights in the work worldwide through the CC0 1.0 Universal public domain dedication.</w:t>
       </w:r>
     </w:p>
     <w:p>
@@ -304,7 +380,15 @@
         <w:t>Copyright / License - CC0 1.0</w:t>
       </w:r>
       <w:r>
-        <w:t>: The person who associated a work with this deed has dedicated the work to the public domain by waiving all of his or her rights to the work worldwide under copyright law, including all related and neighboring rights, to the extent allowed by law. You can copy, modify, distribute, and perform the work, even for commercial purposes, all without asking permission. </w:t>
+        <w:t xml:space="preserve">: The person who associated a work with this deed has dedicated the work to the public domain by waiving </w:t>
+      </w:r>
+      <w:proofErr w:type="gramStart"/>
+      <w:r>
+        <w:t>all of</w:t>
+      </w:r>
+      <w:proofErr w:type="gramEnd"/>
+      <w:r>
+        <w:t xml:space="preserve"> his or her rights to the work worldwide under copyright law, including all related and neighboring rights, to the extent allowed by law. You can copy, modify, distribute, and perform the work, even for commercial purposes, all without asking permission. </w:t>
       </w:r>
     </w:p>
     <w:p>

</xml_diff>

<commit_message>
Fixed crash when selecting moving bed tab on a viewed QRev QM.
</commit_message>
<xml_diff>
--- a/UI/Help/QRev_About.docx
+++ b/UI/Help/QRev_About.docx
@@ -1,6 +1,6 @@
 
 <file path=word/document.xml><?xml version="1.0" encoding="utf-8"?>
-<w:document xmlns:wpc="http://schemas.microsoft.com/office/word/2010/wordprocessingCanvas" xmlns:cx="http://schemas.microsoft.com/office/drawing/2014/chartex" xmlns:cx1="http://schemas.microsoft.com/office/drawing/2015/9/8/chartex" xmlns:cx2="http://schemas.microsoft.com/office/drawing/2015/10/21/chartex" xmlns:cx3="http://schemas.microsoft.com/office/drawing/2016/5/9/chartex" xmlns:cx4="http://schemas.microsoft.com/office/drawing/2016/5/10/chartex" xmlns:cx5="http://schemas.microsoft.com/office/drawing/2016/5/11/chartex" xmlns:cx6="http://schemas.microsoft.com/office/drawing/2016/5/12/chartex" xmlns:cx7="http://schemas.microsoft.com/office/drawing/2016/5/13/chartex" xmlns:cx8="http://schemas.microsoft.com/office/drawing/2016/5/14/chartex" xmlns:mc="http://schemas.openxmlformats.org/markup-compatibility/2006" xmlns:aink="http://schemas.microsoft.com/office/drawing/2016/ink" xmlns:am3d="http://schemas.microsoft.com/office/drawing/2017/model3d" xmlns:o="urn:schemas-microsoft-com:office:office" xmlns:r="http://schemas.openxmlformats.org/officeDocument/2006/relationships" xmlns:m="http://schemas.openxmlformats.org/officeDocument/2006/math" xmlns:v="urn:schemas-microsoft-com:vml" xmlns:wp14="http://schemas.microsoft.com/office/word/2010/wordprocessingDrawing" xmlns:wp="http://schemas.openxmlformats.org/drawingml/2006/wordprocessingDrawing" xmlns:w10="urn:schemas-microsoft-com:office:word" xmlns:w="http://schemas.openxmlformats.org/wordprocessingml/2006/main" xmlns:w14="http://schemas.microsoft.com/office/word/2010/wordml" xmlns:w15="http://schemas.microsoft.com/office/word/2012/wordml" xmlns:w16cex="http://schemas.microsoft.com/office/word/2018/wordml/cex" xmlns:w16cid="http://schemas.microsoft.com/office/word/2016/wordml/cid" xmlns:w16="http://schemas.microsoft.com/office/word/2018/wordml" xmlns:w16se="http://schemas.microsoft.com/office/word/2015/wordml/symex" xmlns:wpg="http://schemas.microsoft.com/office/word/2010/wordprocessingGroup" xmlns:wpi="http://schemas.microsoft.com/office/word/2010/wordprocessingInk" xmlns:wne="http://schemas.microsoft.com/office/word/2006/wordml" xmlns:wps="http://schemas.microsoft.com/office/word/2010/wordprocessingShape" mc:Ignorable="w14 w15 w16se w16cid w16 w16cex wp14">
+<w:document xmlns:wpc="http://schemas.microsoft.com/office/word/2010/wordprocessingCanvas" xmlns:cx="http://schemas.microsoft.com/office/drawing/2014/chartex" xmlns:cx1="http://schemas.microsoft.com/office/drawing/2015/9/8/chartex" xmlns:cx2="http://schemas.microsoft.com/office/drawing/2015/10/21/chartex" xmlns:cx3="http://schemas.microsoft.com/office/drawing/2016/5/9/chartex" xmlns:cx4="http://schemas.microsoft.com/office/drawing/2016/5/10/chartex" xmlns:cx5="http://schemas.microsoft.com/office/drawing/2016/5/11/chartex" xmlns:cx6="http://schemas.microsoft.com/office/drawing/2016/5/12/chartex" xmlns:cx7="http://schemas.microsoft.com/office/drawing/2016/5/13/chartex" xmlns:cx8="http://schemas.microsoft.com/office/drawing/2016/5/14/chartex" xmlns:mc="http://schemas.openxmlformats.org/markup-compatibility/2006" xmlns:aink="http://schemas.microsoft.com/office/drawing/2016/ink" xmlns:am3d="http://schemas.microsoft.com/office/drawing/2017/model3d" xmlns:o="urn:schemas-microsoft-com:office:office" xmlns:r="http://schemas.openxmlformats.org/officeDocument/2006/relationships" xmlns:m="http://schemas.openxmlformats.org/officeDocument/2006/math" xmlns:v="urn:schemas-microsoft-com:vml" xmlns:wp14="http://schemas.microsoft.com/office/word/2010/wordprocessingDrawing" xmlns:wp="http://schemas.openxmlformats.org/drawingml/2006/wordprocessingDrawing" xmlns:w10="urn:schemas-microsoft-com:office:word" xmlns:w="http://schemas.openxmlformats.org/wordprocessingml/2006/main" xmlns:w14="http://schemas.microsoft.com/office/word/2010/wordml" xmlns:w15="http://schemas.microsoft.com/office/word/2012/wordml" xmlns:w16cex="http://schemas.microsoft.com/office/word/2018/wordml/cex" xmlns:w16cid="http://schemas.microsoft.com/office/word/2016/wordml/cid" xmlns:w16="http://schemas.microsoft.com/office/word/2018/wordml" xmlns:w16sdtdh="http://schemas.microsoft.com/office/word/2020/wordml/sdtdatahash" xmlns:w16se="http://schemas.microsoft.com/office/word/2015/wordml/symex" xmlns:wpg="http://schemas.microsoft.com/office/word/2010/wordprocessingGroup" xmlns:wpi="http://schemas.microsoft.com/office/word/2010/wordprocessingInk" xmlns:wne="http://schemas.microsoft.com/office/word/2006/wordml" xmlns:wps="http://schemas.microsoft.com/office/word/2010/wordprocessingShape" mc:Ignorable="w14 w15 w16se w16cid w16 w16cex w16sdtdh wp14">
   <w:body>
     <w:p>
       <w:pPr>
@@ -108,7 +108,7 @@
           <w:b/>
           <w:bCs/>
         </w:rPr>
-        <w:t>27</w:t>
+        <w:t>30</w:t>
       </w:r>
       <w:r>
         <w:rPr>
@@ -129,7 +129,14 @@
           <w:b/>
           <w:bCs/>
         </w:rPr>
-        <w:t>10/1</w:t>
+        <w:t>5</w:t>
+      </w:r>
+      <w:r>
+        <w:rPr>
+          <w:b/>
+          <w:bCs/>
+        </w:rPr>
+        <w:t>/1</w:t>
       </w:r>
       <w:r>
         <w:rPr>
@@ -143,7 +150,7 @@
           <w:b/>
           <w:bCs/>
         </w:rPr>
-        <w:t>1</w:t>
+        <w:t>2</w:t>
       </w:r>
     </w:p>
     <w:p>
@@ -324,7 +331,7 @@
 </file>
 
 <file path=word/styles.xml><?xml version="1.0" encoding="utf-8"?>
-<w:styles xmlns:mc="http://schemas.openxmlformats.org/markup-compatibility/2006" xmlns:r="http://schemas.openxmlformats.org/officeDocument/2006/relationships" xmlns:w="http://schemas.openxmlformats.org/wordprocessingml/2006/main" xmlns:w14="http://schemas.microsoft.com/office/word/2010/wordml" xmlns:w15="http://schemas.microsoft.com/office/word/2012/wordml" xmlns:w16cex="http://schemas.microsoft.com/office/word/2018/wordml/cex" xmlns:w16cid="http://schemas.microsoft.com/office/word/2016/wordml/cid" xmlns:w16="http://schemas.microsoft.com/office/word/2018/wordml" xmlns:w16se="http://schemas.microsoft.com/office/word/2015/wordml/symex" mc:Ignorable="w14 w15 w16se w16cid w16 w16cex">
+<w:styles xmlns:mc="http://schemas.openxmlformats.org/markup-compatibility/2006" xmlns:r="http://schemas.openxmlformats.org/officeDocument/2006/relationships" xmlns:w="http://schemas.openxmlformats.org/wordprocessingml/2006/main" xmlns:w14="http://schemas.microsoft.com/office/word/2010/wordml" xmlns:w15="http://schemas.microsoft.com/office/word/2012/wordml" xmlns:w16cex="http://schemas.microsoft.com/office/word/2018/wordml/cex" xmlns:w16cid="http://schemas.microsoft.com/office/word/2016/wordml/cid" xmlns:w16="http://schemas.microsoft.com/office/word/2018/wordml" xmlns:w16sdtdh="http://schemas.microsoft.com/office/word/2020/wordml/sdtdatahash" xmlns:w16se="http://schemas.microsoft.com/office/word/2015/wordml/symex" mc:Ignorable="w14 w15 w16se w16cid w16 w16cex w16sdtdh">
   <w:docDefaults>
     <w:rPrDefault>
       <w:rPr>

</xml_diff>

<commit_message>
MAP: 1) move import statement for sklearn, it made no difference
Oursin: 1) commented out profilehooks import, 2) changed Pandas concat to append for version compatibility

QRev: 1) modified splash screen code, but currently not used, 2) changed version to 1.21, 3) fixed typo in fig_calls for discharge plot, 4) fixed issue with main tab figs and fig_calls

QRevInt36.spec: 1) added spec file for compiling with Python 3.6

Update documentation

Updated and provide more detail in requirements.txt
</commit_message>
<xml_diff>
--- a/UI/Help/QRev_About.docx
+++ b/UI/Help/QRev_About.docx
@@ -1,6 +1,6 @@
 
 <file path=word/document.xml><?xml version="1.0" encoding="utf-8"?>
-<w:document xmlns:wpc="http://schemas.microsoft.com/office/word/2010/wordprocessingCanvas" xmlns:cx="http://schemas.microsoft.com/office/drawing/2014/chartex" xmlns:cx1="http://schemas.microsoft.com/office/drawing/2015/9/8/chartex" xmlns:cx2="http://schemas.microsoft.com/office/drawing/2015/10/21/chartex" xmlns:cx3="http://schemas.microsoft.com/office/drawing/2016/5/9/chartex" xmlns:cx4="http://schemas.microsoft.com/office/drawing/2016/5/10/chartex" xmlns:cx5="http://schemas.microsoft.com/office/drawing/2016/5/11/chartex" xmlns:cx6="http://schemas.microsoft.com/office/drawing/2016/5/12/chartex" xmlns:cx7="http://schemas.microsoft.com/office/drawing/2016/5/13/chartex" xmlns:cx8="http://schemas.microsoft.com/office/drawing/2016/5/14/chartex" xmlns:mc="http://schemas.openxmlformats.org/markup-compatibility/2006" xmlns:aink="http://schemas.microsoft.com/office/drawing/2016/ink" xmlns:am3d="http://schemas.microsoft.com/office/drawing/2017/model3d" xmlns:o="urn:schemas-microsoft-com:office:office" xmlns:r="http://schemas.openxmlformats.org/officeDocument/2006/relationships" xmlns:m="http://schemas.openxmlformats.org/officeDocument/2006/math" xmlns:v="urn:schemas-microsoft-com:vml" xmlns:wp14="http://schemas.microsoft.com/office/word/2010/wordprocessingDrawing" xmlns:wp="http://schemas.openxmlformats.org/drawingml/2006/wordprocessingDrawing" xmlns:w10="urn:schemas-microsoft-com:office:word" xmlns:w="http://schemas.openxmlformats.org/wordprocessingml/2006/main" xmlns:w14="http://schemas.microsoft.com/office/word/2010/wordml" xmlns:w15="http://schemas.microsoft.com/office/word/2012/wordml" xmlns:w16cex="http://schemas.microsoft.com/office/word/2018/wordml/cex" xmlns:w16cid="http://schemas.microsoft.com/office/word/2016/wordml/cid" xmlns:w16="http://schemas.microsoft.com/office/word/2018/wordml" xmlns:w16sdtdh="http://schemas.microsoft.com/office/word/2020/wordml/sdtdatahash" xmlns:w16se="http://schemas.microsoft.com/office/word/2015/wordml/symex" xmlns:wpg="http://schemas.microsoft.com/office/word/2010/wordprocessingGroup" xmlns:wpi="http://schemas.microsoft.com/office/word/2010/wordprocessingInk" xmlns:wne="http://schemas.microsoft.com/office/word/2006/wordml" xmlns:wps="http://schemas.microsoft.com/office/word/2010/wordprocessingShape" mc:Ignorable="w14 w15 w16se w16cid w16 w16cex w16sdtdh wp14">
+<w:document xmlns:wpc="http://schemas.microsoft.com/office/word/2010/wordprocessingCanvas" xmlns:cx="http://schemas.microsoft.com/office/drawing/2014/chartex" xmlns:cx1="http://schemas.microsoft.com/office/drawing/2015/9/8/chartex" xmlns:cx2="http://schemas.microsoft.com/office/drawing/2015/10/21/chartex" xmlns:cx3="http://schemas.microsoft.com/office/drawing/2016/5/9/chartex" xmlns:cx4="http://schemas.microsoft.com/office/drawing/2016/5/10/chartex" xmlns:cx5="http://schemas.microsoft.com/office/drawing/2016/5/11/chartex" xmlns:cx6="http://schemas.microsoft.com/office/drawing/2016/5/12/chartex" xmlns:cx7="http://schemas.microsoft.com/office/drawing/2016/5/13/chartex" xmlns:cx8="http://schemas.microsoft.com/office/drawing/2016/5/14/chartex" xmlns:mc="http://schemas.openxmlformats.org/markup-compatibility/2006" xmlns:aink="http://schemas.microsoft.com/office/drawing/2016/ink" xmlns:am3d="http://schemas.microsoft.com/office/drawing/2017/model3d" xmlns:o="urn:schemas-microsoft-com:office:office" xmlns:oel="http://schemas.microsoft.com/office/2019/extlst" xmlns:r="http://schemas.openxmlformats.org/officeDocument/2006/relationships" xmlns:m="http://schemas.openxmlformats.org/officeDocument/2006/math" xmlns:v="urn:schemas-microsoft-com:vml" xmlns:wp14="http://schemas.microsoft.com/office/word/2010/wordprocessingDrawing" xmlns:wp="http://schemas.openxmlformats.org/drawingml/2006/wordprocessingDrawing" xmlns:w10="urn:schemas-microsoft-com:office:word" xmlns:w="http://schemas.openxmlformats.org/wordprocessingml/2006/main" xmlns:w14="http://schemas.microsoft.com/office/word/2010/wordml" xmlns:w15="http://schemas.microsoft.com/office/word/2012/wordml" xmlns:w16cex="http://schemas.microsoft.com/office/word/2018/wordml/cex" xmlns:w16cid="http://schemas.microsoft.com/office/word/2016/wordml/cid" xmlns:w16="http://schemas.microsoft.com/office/word/2018/wordml" xmlns:w16du="http://schemas.microsoft.com/office/word/2023/wordml/word16du" xmlns:w16sdtdh="http://schemas.microsoft.com/office/word/2020/wordml/sdtdatahash" xmlns:w16se="http://schemas.microsoft.com/office/word/2015/wordml/symex" xmlns:wpg="http://schemas.microsoft.com/office/word/2010/wordprocessingGroup" xmlns:wpi="http://schemas.microsoft.com/office/word/2010/wordprocessingInk" xmlns:wne="http://schemas.microsoft.com/office/word/2006/wordml" xmlns:wps="http://schemas.microsoft.com/office/word/2010/wordprocessingShape" mc:Ignorable="w14 w15 w16se w16cid w16 w16cex w16sdtdh wp14">
   <w:body>
     <w:p>
       <w:pPr>
@@ -122,6 +122,13 @@
           <w:b/>
           <w:bCs/>
         </w:rPr>
+        <w:t>2</w:t>
+      </w:r>
+      <w:r>
+        <w:rPr>
+          <w:b/>
+          <w:bCs/>
+        </w:rPr>
         <w:t>1</w:t>
       </w:r>
       <w:r>
@@ -129,13 +136,6 @@
           <w:b/>
           <w:bCs/>
         </w:rPr>
-        <w:t>8</w:t>
-      </w:r>
-      <w:r>
-        <w:rPr>
-          <w:b/>
-          <w:bCs/>
-        </w:rPr>
         <w:br/>
       </w:r>
       <w:r>
@@ -150,35 +150,35 @@
           <w:b/>
           <w:bCs/>
         </w:rPr>
+        <w:t>5</w:t>
+      </w:r>
+      <w:r>
+        <w:rPr>
+          <w:b/>
+          <w:bCs/>
+        </w:rPr>
+        <w:t>/</w:t>
+      </w:r>
+      <w:r>
+        <w:rPr>
+          <w:b/>
+          <w:bCs/>
+        </w:rPr>
+        <w:t>2</w:t>
+      </w:r>
+      <w:r>
+        <w:rPr>
+          <w:b/>
+          <w:bCs/>
+        </w:rPr>
+        <w:t>/202</w:t>
+      </w:r>
+      <w:r>
+        <w:rPr>
+          <w:b/>
+          <w:bCs/>
+        </w:rPr>
         <w:t>3</w:t>
-      </w:r>
-      <w:r>
-        <w:rPr>
-          <w:b/>
-          <w:bCs/>
-        </w:rPr>
-        <w:t>/</w:t>
-      </w:r>
-      <w:r>
-        <w:rPr>
-          <w:b/>
-          <w:bCs/>
-        </w:rPr>
-        <w:t>2</w:t>
-      </w:r>
-      <w:r>
-        <w:rPr>
-          <w:b/>
-          <w:bCs/>
-        </w:rPr>
-        <w:t>8</w:t>
-      </w:r>
-      <w:r>
-        <w:rPr>
-          <w:b/>
-          <w:bCs/>
-        </w:rPr>
-        <w:t>/2022</w:t>
       </w:r>
     </w:p>
     <w:p>
@@ -273,74 +273,13 @@
         <w:t xml:space="preserve">: </w:t>
       </w:r>
       <w:r>
-        <w:t xml:space="preserve">This software (QRevInt) is a fork of </w:t>
-      </w:r>
-      <w:proofErr w:type="spellStart"/>
-      <w:r>
-        <w:t>QRev</w:t>
-      </w:r>
-      <w:proofErr w:type="spellEnd"/>
+        <w:t>This software (QRevInt) is a fork of QRev</w:t>
+      </w:r>
       <w:r>
         <w:t>, which</w:t>
       </w:r>
       <w:r>
-        <w:t xml:space="preserve"> was originally approved for release by the U.S. Geological Survey (USGS), IP-118174. Genesis </w:t>
-      </w:r>
-      <w:proofErr w:type="spellStart"/>
-      <w:r>
-        <w:t>HydroTech</w:t>
-      </w:r>
-      <w:proofErr w:type="spellEnd"/>
-      <w:r>
-        <w:t xml:space="preserve"> LLC through funding from various international agencies is working to improve and expand the capabilities and features available in QRevInt. While Genesis </w:t>
-      </w:r>
-      <w:proofErr w:type="spellStart"/>
-      <w:r>
-        <w:t>HydroTech</w:t>
-      </w:r>
-      <w:proofErr w:type="spellEnd"/>
-      <w:r>
-        <w:t xml:space="preserve"> LLC makes every effort to deliver high quality products, Genesis </w:t>
-      </w:r>
-      <w:proofErr w:type="spellStart"/>
-      <w:r>
-        <w:t>HydroTech</w:t>
-      </w:r>
-      <w:proofErr w:type="spellEnd"/>
-      <w:r>
-        <w:t xml:space="preserve"> LLC does not guarantee that the product is free from defects. QRevInt is provided “as is," and you use the software at your own risk. Genesis </w:t>
-      </w:r>
-      <w:proofErr w:type="spellStart"/>
-      <w:r>
-        <w:t>HydroTech</w:t>
-      </w:r>
-      <w:proofErr w:type="spellEnd"/>
-      <w:r>
-        <w:t xml:space="preserve"> LLC and contributing agencies make no warranties as to performance, merchantability, fitness for a particular purpose, or any other warranties whether expressed or implied. No oral or written communication from or information provided by Genesis </w:t>
-      </w:r>
-      <w:proofErr w:type="spellStart"/>
-      <w:r>
-        <w:t>HydroTech</w:t>
-      </w:r>
-      <w:proofErr w:type="spellEnd"/>
-      <w:r>
-        <w:t xml:space="preserve"> LLC or contributing agencies shall create a warranty. Under no circumstances shall Genesis </w:t>
-      </w:r>
-      <w:proofErr w:type="spellStart"/>
-      <w:r>
-        <w:t>HydroTech</w:t>
-      </w:r>
-      <w:proofErr w:type="spellEnd"/>
-      <w:r>
-        <w:t xml:space="preserve"> LLC or the contributing agencies be liable for direct, indirect, special, incidental, or consequential damages resulting from the use, misuse, or inability to use this software, even if Genesis </w:t>
-      </w:r>
-      <w:proofErr w:type="spellStart"/>
-      <w:r>
-        <w:t>HydroTech</w:t>
-      </w:r>
-      <w:proofErr w:type="spellEnd"/>
-      <w:r>
-        <w:t xml:space="preserve"> LLC or the contributing agencies have been advised of the possibility of such damages.</w:t>
+        <w:t xml:space="preserve"> was originally approved for release by the U.S. Geological Survey (USGS), IP-118174. Genesis HydroTech LLC through funding from various international agencies is working to improve and expand the capabilities and features available in QRevInt. While Genesis HydroTech LLC makes every effort to deliver high quality products, Genesis HydroTech LLC does not guarantee that the product is free from defects. QRevInt is provided “as is," and you use the software at your own risk. Genesis HydroTech LLC and contributing agencies make no warranties as to performance, merchantability, fitness for a particular purpose, or any other warranties whether expressed or implied. No oral or written communication from or information provided by Genesis HydroTech LLC or contributing agencies shall create a warranty. Under no circumstances shall Genesis HydroTech LLC or the contributing agencies be liable for direct, indirect, special, incidental, or consequential damages resulting from the use, misuse, or inability to use this software, even if Genesis HydroTech LLC or the contributing agencies have been advised of the possibility of such damages.</w:t>
       </w:r>
     </w:p>
     <w:p>
@@ -355,15 +294,7 @@
         <w:t xml:space="preserve">: </w:t>
       </w:r>
       <w:r>
-        <w:t xml:space="preserve">Unless otherwise noted, this project is in the public domain in the United States because it contains materials that originally came from the United States Geological Survey, an agency of the United States Department of Interior. For more information, see the official USGS copyright policy at https://www.usgs.gov/information-policies-and-instructions/copyrights-and-credits. Additionally, Genesis </w:t>
-      </w:r>
-      <w:proofErr w:type="spellStart"/>
-      <w:r>
-        <w:t>HydroTech</w:t>
-      </w:r>
-      <w:proofErr w:type="spellEnd"/>
-      <w:r>
-        <w:t xml:space="preserve"> LLC waives copyright and related rights in the work worldwide through the CC0 1.0 Universal public domain dedication.</w:t>
+        <w:t>Unless otherwise noted, this project is in the public domain in the United States because it contains materials that originally came from the United States Geological Survey, an agency of the United States Department of Interior. For more information, see the official USGS copyright policy at https://www.usgs.gov/information-policies-and-instructions/copyrights-and-credits. Additionally, Genesis HydroTech LLC waives copyright and related rights in the work worldwide through the CC0 1.0 Universal public domain dedication.</w:t>
       </w:r>
     </w:p>
     <w:p>
@@ -380,15 +311,7 @@
         <w:t>Copyright / License - CC0 1.0</w:t>
       </w:r>
       <w:r>
-        <w:t xml:space="preserve">: The person who associated a work with this deed has dedicated the work to the public domain by waiving </w:t>
-      </w:r>
-      <w:proofErr w:type="gramStart"/>
-      <w:r>
-        <w:t>all of</w:t>
-      </w:r>
-      <w:proofErr w:type="gramEnd"/>
-      <w:r>
-        <w:t xml:space="preserve"> his or her rights to the work worldwide under copyright law, including all related and neighboring rights, to the extent allowed by law. You can copy, modify, distribute, and perform the work, even for commercial purposes, all without asking permission. </w:t>
+        <w:t>: The person who associated a work with this deed has dedicated the work to the public domain by waiving all of his or her rights to the work worldwide under copyright law, including all related and neighboring rights, to the extent allowed by law. You can copy, modify, distribute, and perform the work, even for commercial purposes, all without asking permission. </w:t>
       </w:r>
     </w:p>
     <w:p>

</xml_diff>

<commit_message>
Measurement: 1) added export_xs to attribute description
QComp: 1) added speeds to attribute description

Updated documentation
</commit_message>
<xml_diff>
--- a/UI/Help/QRev_About.docx
+++ b/UI/Help/QRev_About.docx
@@ -1,6 +1,6 @@
 
 <file path=word/document.xml><?xml version="1.0" encoding="utf-8"?>
-<w:document xmlns:wpc="http://schemas.microsoft.com/office/word/2010/wordprocessingCanvas" xmlns:cx="http://schemas.microsoft.com/office/drawing/2014/chartex" xmlns:cx1="http://schemas.microsoft.com/office/drawing/2015/9/8/chartex" xmlns:cx2="http://schemas.microsoft.com/office/drawing/2015/10/21/chartex" xmlns:cx3="http://schemas.microsoft.com/office/drawing/2016/5/9/chartex" xmlns:cx4="http://schemas.microsoft.com/office/drawing/2016/5/10/chartex" xmlns:cx5="http://schemas.microsoft.com/office/drawing/2016/5/11/chartex" xmlns:cx6="http://schemas.microsoft.com/office/drawing/2016/5/12/chartex" xmlns:cx7="http://schemas.microsoft.com/office/drawing/2016/5/13/chartex" xmlns:cx8="http://schemas.microsoft.com/office/drawing/2016/5/14/chartex" xmlns:mc="http://schemas.openxmlformats.org/markup-compatibility/2006" xmlns:aink="http://schemas.microsoft.com/office/drawing/2016/ink" xmlns:am3d="http://schemas.microsoft.com/office/drawing/2017/model3d" xmlns:o="urn:schemas-microsoft-com:office:office" xmlns:oel="http://schemas.microsoft.com/office/2019/extlst" xmlns:r="http://schemas.openxmlformats.org/officeDocument/2006/relationships" xmlns:m="http://schemas.openxmlformats.org/officeDocument/2006/math" xmlns:v="urn:schemas-microsoft-com:vml" xmlns:wp14="http://schemas.microsoft.com/office/word/2010/wordprocessingDrawing" xmlns:wp="http://schemas.openxmlformats.org/drawingml/2006/wordprocessingDrawing" xmlns:w10="urn:schemas-microsoft-com:office:word" xmlns:w="http://schemas.openxmlformats.org/wordprocessingml/2006/main" xmlns:w14="http://schemas.microsoft.com/office/word/2010/wordml" xmlns:w15="http://schemas.microsoft.com/office/word/2012/wordml" xmlns:w16cex="http://schemas.microsoft.com/office/word/2018/wordml/cex" xmlns:w16cid="http://schemas.microsoft.com/office/word/2016/wordml/cid" xmlns:w16="http://schemas.microsoft.com/office/word/2018/wordml" xmlns:w16du="http://schemas.microsoft.com/office/word/2023/wordml/word16du" xmlns:w16sdtdh="http://schemas.microsoft.com/office/word/2020/wordml/sdtdatahash" xmlns:w16se="http://schemas.microsoft.com/office/word/2015/wordml/symex" xmlns:wpg="http://schemas.microsoft.com/office/word/2010/wordprocessingGroup" xmlns:wpi="http://schemas.microsoft.com/office/word/2010/wordprocessingInk" xmlns:wne="http://schemas.microsoft.com/office/word/2006/wordml" xmlns:wps="http://schemas.microsoft.com/office/word/2010/wordprocessingShape" mc:Ignorable="w14 w15 w16se w16cid w16 w16cex w16sdtdh wp14">
+<w:document xmlns:wpc="http://schemas.microsoft.com/office/word/2010/wordprocessingCanvas" xmlns:cx="http://schemas.microsoft.com/office/drawing/2014/chartex" xmlns:cx1="http://schemas.microsoft.com/office/drawing/2015/9/8/chartex" xmlns:cx2="http://schemas.microsoft.com/office/drawing/2015/10/21/chartex" xmlns:cx3="http://schemas.microsoft.com/office/drawing/2016/5/9/chartex" xmlns:cx4="http://schemas.microsoft.com/office/drawing/2016/5/10/chartex" xmlns:cx5="http://schemas.microsoft.com/office/drawing/2016/5/11/chartex" xmlns:cx6="http://schemas.microsoft.com/office/drawing/2016/5/12/chartex" xmlns:cx7="http://schemas.microsoft.com/office/drawing/2016/5/13/chartex" xmlns:cx8="http://schemas.microsoft.com/office/drawing/2016/5/14/chartex" xmlns:mc="http://schemas.openxmlformats.org/markup-compatibility/2006" xmlns:aink="http://schemas.microsoft.com/office/drawing/2016/ink" xmlns:am3d="http://schemas.microsoft.com/office/drawing/2017/model3d" xmlns:o="urn:schemas-microsoft-com:office:office" xmlns:oel="http://schemas.microsoft.com/office/2019/extlst" xmlns:r="http://schemas.openxmlformats.org/officeDocument/2006/relationships" xmlns:m="http://schemas.openxmlformats.org/officeDocument/2006/math" xmlns:v="urn:schemas-microsoft-com:vml" xmlns:wp14="http://schemas.microsoft.com/office/word/2010/wordprocessingDrawing" xmlns:wp="http://schemas.openxmlformats.org/drawingml/2006/wordprocessingDrawing" xmlns:w10="urn:schemas-microsoft-com:office:word" xmlns:w="http://schemas.openxmlformats.org/wordprocessingml/2006/main" xmlns:w14="http://schemas.microsoft.com/office/word/2010/wordml" xmlns:w15="http://schemas.microsoft.com/office/word/2012/wordml" xmlns:w16cex="http://schemas.microsoft.com/office/word/2018/wordml/cex" xmlns:w16cid="http://schemas.microsoft.com/office/word/2016/wordml/cid" xmlns:w16="http://schemas.microsoft.com/office/word/2018/wordml" xmlns:w16sdtdh="http://schemas.microsoft.com/office/word/2020/wordml/sdtdatahash" xmlns:w16se="http://schemas.microsoft.com/office/word/2015/wordml/symex" xmlns:wpg="http://schemas.microsoft.com/office/word/2010/wordprocessingGroup" xmlns:wpi="http://schemas.microsoft.com/office/word/2010/wordprocessingInk" xmlns:wne="http://schemas.microsoft.com/office/word/2006/wordml" xmlns:wps="http://schemas.microsoft.com/office/word/2010/wordprocessingShape" mc:Ignorable="w14 w15 w16se w16cid w16 w16cex w16sdtdh wp14">
   <w:body>
     <w:p>
       <w:pPr>
@@ -129,7 +129,7 @@
           <w:b/>
           <w:bCs/>
         </w:rPr>
-        <w:t>1</w:t>
+        <w:t>3</w:t>
       </w:r>
       <w:r>
         <w:rPr>
@@ -150,7 +150,7 @@
           <w:b/>
           <w:bCs/>
         </w:rPr>
-        <w:t>5</w:t>
+        <w:t>6</w:t>
       </w:r>
       <w:r>
         <w:rPr>
@@ -164,7 +164,7 @@
           <w:b/>
           <w:bCs/>
         </w:rPr>
-        <w:t>2</w:t>
+        <w:t>16</w:t>
       </w:r>
       <w:r>
         <w:rPr>

</xml_diff>